<commit_message>
Add complete univariate EDA appendix
</commit_message>
<xml_diff>
--- a/Milestone_1_Insurance_Price_Prediction.docx
+++ b/Milestone_1_Insurance_Price_Prediction.docx
@@ -605,7 +605,7 @@
               <w:rPr>
                 <w:sz w:val="11"/>
               </w:rPr>
-              <w:t>outputs/tables/numeric_summary.csv; outputs/figures/target_distribution.png; outputs/figures/outlier_boxplots.png</w:t>
+              <w:t>outputs/tables/numeric_summary.csv; outputs/tables/univariate_plot_interpretations.csv; outputs/figures/univariate_*.png</w:t>
             </w:r>
           </w:p>
         </w:tc>
@@ -677,7 +677,7 @@
               <w:rPr>
                 <w:sz w:val="11"/>
               </w:rPr>
-              <w:t>outputs/tables/categorical_frequency.csv; outputs/tables/group_summary_*.csv</w:t>
+              <w:t>outputs/tables/categorical_frequency.csv; outputs/tables/group_summary_*.csv; outputs/figures/univariate_*.png</w:t>
             </w:r>
           </w:p>
         </w:tc>
@@ -6098,6 +6098,14 @@
       </w:pPr>
       <w:r>
         <w:t>Unknown smoking status is treated as a valid business category rather than a missing value.</w:t>
+      </w:r>
+    </w:p>
+    <w:p>
+      <w:pPr>
+        <w:pStyle w:val="ListBullet"/>
+      </w:pPr>
+      <w:r>
+        <w:t>A complete univariate plot appendix is included for every original source variable, with technical and business interpretation for each plot.</w:t>
       </w:r>
     </w:p>
     <w:p>
@@ -9335,6 +9343,4160 @@
         <w:pStyle w:val="Heading2"/>
       </w:pPr>
       <w:r>
+        <w:t>Complete Univariate Plot Appendix</w:t>
+      </w:r>
+    </w:p>
+    <w:tbl>
+      <w:tblPr>
+        <w:tblStyle w:val="TableGrid"/>
+        <w:tblW w:type="auto" w:w="0"/>
+        <w:tblLook w:firstColumn="1" w:firstRow="1" w:lastColumn="0" w:lastRow="0" w:noHBand="0" w:noVBand="1" w:val="04A0"/>
+      </w:tblPr>
+      <w:tblGrid>
+        <w:gridCol w:w="1440"/>
+        <w:gridCol w:w="1440"/>
+        <w:gridCol w:w="1440"/>
+        <w:gridCol w:w="1440"/>
+        <w:gridCol w:w="1440"/>
+        <w:gridCol w:w="1440"/>
+      </w:tblGrid>
+      <w:tr>
+        <w:tc>
+          <w:tcPr>
+            <w:tcW w:type="dxa" w:w="1440"/>
+            <w:shd w:fill="12355B"/>
+          </w:tcPr>
+          <w:p>
+            <w:r>
+              <w:rPr>
+                <w:b/>
+                <w:color w:val="FFFFFF"/>
+                <w:sz w:val="11"/>
+              </w:rPr>
+              <w:t>original_column</w:t>
+            </w:r>
+          </w:p>
+        </w:tc>
+        <w:tc>
+          <w:tcPr>
+            <w:tcW w:type="dxa" w:w="1440"/>
+            <w:shd w:fill="12355B"/>
+          </w:tcPr>
+          <w:p>
+            <w:r>
+              <w:rPr>
+                <w:b/>
+                <w:color w:val="FFFFFF"/>
+                <w:sz w:val="11"/>
+              </w:rPr>
+              <w:t>clean_column</w:t>
+            </w:r>
+          </w:p>
+        </w:tc>
+        <w:tc>
+          <w:tcPr>
+            <w:tcW w:type="dxa" w:w="1440"/>
+            <w:shd w:fill="12355B"/>
+          </w:tcPr>
+          <w:p>
+            <w:r>
+              <w:rPr>
+                <w:b/>
+                <w:color w:val="FFFFFF"/>
+                <w:sz w:val="11"/>
+              </w:rPr>
+              <w:t>analysis_type</w:t>
+            </w:r>
+          </w:p>
+        </w:tc>
+        <w:tc>
+          <w:tcPr>
+            <w:tcW w:type="dxa" w:w="1440"/>
+            <w:shd w:fill="12355B"/>
+          </w:tcPr>
+          <w:p>
+            <w:r>
+              <w:rPr>
+                <w:b/>
+                <w:color w:val="FFFFFF"/>
+                <w:sz w:val="11"/>
+              </w:rPr>
+              <w:t>plot_type</w:t>
+            </w:r>
+          </w:p>
+        </w:tc>
+        <w:tc>
+          <w:tcPr>
+            <w:tcW w:type="dxa" w:w="1440"/>
+            <w:shd w:fill="12355B"/>
+          </w:tcPr>
+          <w:p>
+            <w:r>
+              <w:rPr>
+                <w:b/>
+                <w:color w:val="FFFFFF"/>
+                <w:sz w:val="11"/>
+              </w:rPr>
+              <w:t>missing_count</w:t>
+            </w:r>
+          </w:p>
+        </w:tc>
+        <w:tc>
+          <w:tcPr>
+            <w:tcW w:type="dxa" w:w="1440"/>
+            <w:shd w:fill="12355B"/>
+          </w:tcPr>
+          <w:p>
+            <w:r>
+              <w:rPr>
+                <w:b/>
+                <w:color w:val="FFFFFF"/>
+                <w:sz w:val="11"/>
+              </w:rPr>
+              <w:t>unique_count</w:t>
+            </w:r>
+          </w:p>
+        </w:tc>
+      </w:tr>
+      <w:tr>
+        <w:tc>
+          <w:tcPr>
+            <w:tcW w:type="dxa" w:w="1440"/>
+            <w:vAlign w:val="center"/>
+          </w:tcPr>
+          <w:p>
+            <w:r>
+              <w:rPr>
+                <w:sz w:val="11"/>
+              </w:rPr>
+              <w:t>applicant_id</w:t>
+            </w:r>
+          </w:p>
+        </w:tc>
+        <w:tc>
+          <w:tcPr>
+            <w:tcW w:type="dxa" w:w="1440"/>
+            <w:vAlign w:val="center"/>
+          </w:tcPr>
+          <w:p>
+            <w:r>
+              <w:rPr>
+                <w:sz w:val="11"/>
+              </w:rPr>
+              <w:t>applicant_id</w:t>
+            </w:r>
+          </w:p>
+        </w:tc>
+        <w:tc>
+          <w:tcPr>
+            <w:tcW w:type="dxa" w:w="1440"/>
+            <w:vAlign w:val="center"/>
+          </w:tcPr>
+          <w:p>
+            <w:r>
+              <w:rPr>
+                <w:sz w:val="11"/>
+              </w:rPr>
+              <w:t>identifier</w:t>
+            </w:r>
+          </w:p>
+        </w:tc>
+        <w:tc>
+          <w:tcPr>
+            <w:tcW w:type="dxa" w:w="1440"/>
+            <w:vAlign w:val="center"/>
+          </w:tcPr>
+          <w:p>
+            <w:r>
+              <w:rPr>
+                <w:sz w:val="11"/>
+              </w:rPr>
+              <w:t>identifier audit bar chart</w:t>
+            </w:r>
+          </w:p>
+        </w:tc>
+        <w:tc>
+          <w:tcPr>
+            <w:tcW w:type="dxa" w:w="1440"/>
+            <w:vAlign w:val="center"/>
+          </w:tcPr>
+          <w:p>
+            <w:r>
+              <w:rPr>
+                <w:sz w:val="11"/>
+              </w:rPr>
+              <w:t>0</w:t>
+            </w:r>
+          </w:p>
+        </w:tc>
+        <w:tc>
+          <w:tcPr>
+            <w:tcW w:type="dxa" w:w="1440"/>
+            <w:vAlign w:val="center"/>
+          </w:tcPr>
+          <w:p>
+            <w:r>
+              <w:rPr>
+                <w:sz w:val="11"/>
+              </w:rPr>
+              <w:t>25000</w:t>
+            </w:r>
+          </w:p>
+        </w:tc>
+      </w:tr>
+      <w:tr>
+        <w:tc>
+          <w:tcPr>
+            <w:tcW w:type="dxa" w:w="1440"/>
+            <w:vAlign w:val="center"/>
+          </w:tcPr>
+          <w:p>
+            <w:r>
+              <w:rPr>
+                <w:sz w:val="11"/>
+              </w:rPr>
+              <w:t>years_of_insurance_with_us</w:t>
+            </w:r>
+          </w:p>
+        </w:tc>
+        <w:tc>
+          <w:tcPr>
+            <w:tcW w:type="dxa" w:w="1440"/>
+            <w:vAlign w:val="center"/>
+          </w:tcPr>
+          <w:p>
+            <w:r>
+              <w:rPr>
+                <w:sz w:val="11"/>
+              </w:rPr>
+              <w:t>years_of_insurance_with_us</w:t>
+            </w:r>
+          </w:p>
+        </w:tc>
+        <w:tc>
+          <w:tcPr>
+            <w:tcW w:type="dxa" w:w="1440"/>
+            <w:vAlign w:val="center"/>
+          </w:tcPr>
+          <w:p>
+            <w:r>
+              <w:rPr>
+                <w:sz w:val="11"/>
+              </w:rPr>
+              <w:t>ordinal discrete numeric</w:t>
+            </w:r>
+          </w:p>
+        </w:tc>
+        <w:tc>
+          <w:tcPr>
+            <w:tcW w:type="dxa" w:w="1440"/>
+            <w:vAlign w:val="center"/>
+          </w:tcPr>
+          <w:p>
+            <w:r>
+              <w:rPr>
+                <w:sz w:val="11"/>
+              </w:rPr>
+              <w:t>frequency bar chart</w:t>
+            </w:r>
+          </w:p>
+        </w:tc>
+        <w:tc>
+          <w:tcPr>
+            <w:tcW w:type="dxa" w:w="1440"/>
+            <w:vAlign w:val="center"/>
+          </w:tcPr>
+          <w:p>
+            <w:r>
+              <w:rPr>
+                <w:sz w:val="11"/>
+              </w:rPr>
+              <w:t>0</w:t>
+            </w:r>
+          </w:p>
+        </w:tc>
+        <w:tc>
+          <w:tcPr>
+            <w:tcW w:type="dxa" w:w="1440"/>
+            <w:vAlign w:val="center"/>
+          </w:tcPr>
+          <w:p>
+            <w:r>
+              <w:rPr>
+                <w:sz w:val="11"/>
+              </w:rPr>
+              <w:t>9</w:t>
+            </w:r>
+          </w:p>
+        </w:tc>
+      </w:tr>
+      <w:tr>
+        <w:tc>
+          <w:tcPr>
+            <w:tcW w:type="dxa" w:w="1440"/>
+            <w:vAlign w:val="center"/>
+          </w:tcPr>
+          <w:p>
+            <w:r>
+              <w:rPr>
+                <w:sz w:val="11"/>
+              </w:rPr>
+              <w:t>regular_checkup_lasy_year</w:t>
+            </w:r>
+          </w:p>
+        </w:tc>
+        <w:tc>
+          <w:tcPr>
+            <w:tcW w:type="dxa" w:w="1440"/>
+            <w:vAlign w:val="center"/>
+          </w:tcPr>
+          <w:p>
+            <w:r>
+              <w:rPr>
+                <w:sz w:val="11"/>
+              </w:rPr>
+              <w:t>regular_checkup_last_year</w:t>
+            </w:r>
+          </w:p>
+        </w:tc>
+        <w:tc>
+          <w:tcPr>
+            <w:tcW w:type="dxa" w:w="1440"/>
+            <w:vAlign w:val="center"/>
+          </w:tcPr>
+          <w:p>
+            <w:r>
+              <w:rPr>
+                <w:sz w:val="11"/>
+              </w:rPr>
+              <w:t>ordinal discrete numeric</w:t>
+            </w:r>
+          </w:p>
+        </w:tc>
+        <w:tc>
+          <w:tcPr>
+            <w:tcW w:type="dxa" w:w="1440"/>
+            <w:vAlign w:val="center"/>
+          </w:tcPr>
+          <w:p>
+            <w:r>
+              <w:rPr>
+                <w:sz w:val="11"/>
+              </w:rPr>
+              <w:t>frequency bar chart</w:t>
+            </w:r>
+          </w:p>
+        </w:tc>
+        <w:tc>
+          <w:tcPr>
+            <w:tcW w:type="dxa" w:w="1440"/>
+            <w:vAlign w:val="center"/>
+          </w:tcPr>
+          <w:p>
+            <w:r>
+              <w:rPr>
+                <w:sz w:val="11"/>
+              </w:rPr>
+              <w:t>0</w:t>
+            </w:r>
+          </w:p>
+        </w:tc>
+        <w:tc>
+          <w:tcPr>
+            <w:tcW w:type="dxa" w:w="1440"/>
+            <w:vAlign w:val="center"/>
+          </w:tcPr>
+          <w:p>
+            <w:r>
+              <w:rPr>
+                <w:sz w:val="11"/>
+              </w:rPr>
+              <w:t>6</w:t>
+            </w:r>
+          </w:p>
+        </w:tc>
+      </w:tr>
+      <w:tr>
+        <w:tc>
+          <w:tcPr>
+            <w:tcW w:type="dxa" w:w="1440"/>
+            <w:vAlign w:val="center"/>
+          </w:tcPr>
+          <w:p>
+            <w:r>
+              <w:rPr>
+                <w:sz w:val="11"/>
+              </w:rPr>
+              <w:t>adventure_sports</w:t>
+            </w:r>
+          </w:p>
+        </w:tc>
+        <w:tc>
+          <w:tcPr>
+            <w:tcW w:type="dxa" w:w="1440"/>
+            <w:vAlign w:val="center"/>
+          </w:tcPr>
+          <w:p>
+            <w:r>
+              <w:rPr>
+                <w:sz w:val="11"/>
+              </w:rPr>
+              <w:t>adventure_sports</w:t>
+            </w:r>
+          </w:p>
+        </w:tc>
+        <w:tc>
+          <w:tcPr>
+            <w:tcW w:type="dxa" w:w="1440"/>
+            <w:vAlign w:val="center"/>
+          </w:tcPr>
+          <w:p>
+            <w:r>
+              <w:rPr>
+                <w:sz w:val="11"/>
+              </w:rPr>
+              <w:t>binary categorical</w:t>
+            </w:r>
+          </w:p>
+        </w:tc>
+        <w:tc>
+          <w:tcPr>
+            <w:tcW w:type="dxa" w:w="1440"/>
+            <w:vAlign w:val="center"/>
+          </w:tcPr>
+          <w:p>
+            <w:r>
+              <w:rPr>
+                <w:sz w:val="11"/>
+              </w:rPr>
+              <w:t>frequency bar chart</w:t>
+            </w:r>
+          </w:p>
+        </w:tc>
+        <w:tc>
+          <w:tcPr>
+            <w:tcW w:type="dxa" w:w="1440"/>
+            <w:vAlign w:val="center"/>
+          </w:tcPr>
+          <w:p>
+            <w:r>
+              <w:rPr>
+                <w:sz w:val="11"/>
+              </w:rPr>
+              <w:t>0</w:t>
+            </w:r>
+          </w:p>
+        </w:tc>
+        <w:tc>
+          <w:tcPr>
+            <w:tcW w:type="dxa" w:w="1440"/>
+            <w:vAlign w:val="center"/>
+          </w:tcPr>
+          <w:p>
+            <w:r>
+              <w:rPr>
+                <w:sz w:val="11"/>
+              </w:rPr>
+              <w:t>2</w:t>
+            </w:r>
+          </w:p>
+        </w:tc>
+      </w:tr>
+      <w:tr>
+        <w:tc>
+          <w:tcPr>
+            <w:tcW w:type="dxa" w:w="1440"/>
+            <w:vAlign w:val="center"/>
+          </w:tcPr>
+          <w:p>
+            <w:r>
+              <w:rPr>
+                <w:sz w:val="11"/>
+              </w:rPr>
+              <w:t>Occupation</w:t>
+            </w:r>
+          </w:p>
+        </w:tc>
+        <w:tc>
+          <w:tcPr>
+            <w:tcW w:type="dxa" w:w="1440"/>
+            <w:vAlign w:val="center"/>
+          </w:tcPr>
+          <w:p>
+            <w:r>
+              <w:rPr>
+                <w:sz w:val="11"/>
+              </w:rPr>
+              <w:t>Occupation</w:t>
+            </w:r>
+          </w:p>
+        </w:tc>
+        <w:tc>
+          <w:tcPr>
+            <w:tcW w:type="dxa" w:w="1440"/>
+            <w:vAlign w:val="center"/>
+          </w:tcPr>
+          <w:p>
+            <w:r>
+              <w:rPr>
+                <w:sz w:val="11"/>
+              </w:rPr>
+              <w:t>nominal categorical</w:t>
+            </w:r>
+          </w:p>
+        </w:tc>
+        <w:tc>
+          <w:tcPr>
+            <w:tcW w:type="dxa" w:w="1440"/>
+            <w:vAlign w:val="center"/>
+          </w:tcPr>
+          <w:p>
+            <w:r>
+              <w:rPr>
+                <w:sz w:val="11"/>
+              </w:rPr>
+              <w:t>frequency bar chart</w:t>
+            </w:r>
+          </w:p>
+        </w:tc>
+        <w:tc>
+          <w:tcPr>
+            <w:tcW w:type="dxa" w:w="1440"/>
+            <w:vAlign w:val="center"/>
+          </w:tcPr>
+          <w:p>
+            <w:r>
+              <w:rPr>
+                <w:sz w:val="11"/>
+              </w:rPr>
+              <w:t>0</w:t>
+            </w:r>
+          </w:p>
+        </w:tc>
+        <w:tc>
+          <w:tcPr>
+            <w:tcW w:type="dxa" w:w="1440"/>
+            <w:vAlign w:val="center"/>
+          </w:tcPr>
+          <w:p>
+            <w:r>
+              <w:rPr>
+                <w:sz w:val="11"/>
+              </w:rPr>
+              <w:t>3</w:t>
+            </w:r>
+          </w:p>
+        </w:tc>
+      </w:tr>
+      <w:tr>
+        <w:tc>
+          <w:tcPr>
+            <w:tcW w:type="dxa" w:w="1440"/>
+            <w:vAlign w:val="center"/>
+          </w:tcPr>
+          <w:p>
+            <w:r>
+              <w:rPr>
+                <w:sz w:val="11"/>
+              </w:rPr>
+              <w:t>visited_doctor_last_1_year</w:t>
+            </w:r>
+          </w:p>
+        </w:tc>
+        <w:tc>
+          <w:tcPr>
+            <w:tcW w:type="dxa" w:w="1440"/>
+            <w:vAlign w:val="center"/>
+          </w:tcPr>
+          <w:p>
+            <w:r>
+              <w:rPr>
+                <w:sz w:val="11"/>
+              </w:rPr>
+              <w:t>visited_doctor_last_1_year</w:t>
+            </w:r>
+          </w:p>
+        </w:tc>
+        <w:tc>
+          <w:tcPr>
+            <w:tcW w:type="dxa" w:w="1440"/>
+            <w:vAlign w:val="center"/>
+          </w:tcPr>
+          <w:p>
+            <w:r>
+              <w:rPr>
+                <w:sz w:val="11"/>
+              </w:rPr>
+              <w:t>ordinal discrete numeric</w:t>
+            </w:r>
+          </w:p>
+        </w:tc>
+        <w:tc>
+          <w:tcPr>
+            <w:tcW w:type="dxa" w:w="1440"/>
+            <w:vAlign w:val="center"/>
+          </w:tcPr>
+          <w:p>
+            <w:r>
+              <w:rPr>
+                <w:sz w:val="11"/>
+              </w:rPr>
+              <w:t>frequency bar chart</w:t>
+            </w:r>
+          </w:p>
+        </w:tc>
+        <w:tc>
+          <w:tcPr>
+            <w:tcW w:type="dxa" w:w="1440"/>
+            <w:vAlign w:val="center"/>
+          </w:tcPr>
+          <w:p>
+            <w:r>
+              <w:rPr>
+                <w:sz w:val="11"/>
+              </w:rPr>
+              <w:t>0</w:t>
+            </w:r>
+          </w:p>
+        </w:tc>
+        <w:tc>
+          <w:tcPr>
+            <w:tcW w:type="dxa" w:w="1440"/>
+            <w:vAlign w:val="center"/>
+          </w:tcPr>
+          <w:p>
+            <w:r>
+              <w:rPr>
+                <w:sz w:val="11"/>
+              </w:rPr>
+              <w:t>12</w:t>
+            </w:r>
+          </w:p>
+        </w:tc>
+      </w:tr>
+      <w:tr>
+        <w:tc>
+          <w:tcPr>
+            <w:tcW w:type="dxa" w:w="1440"/>
+            <w:vAlign w:val="center"/>
+          </w:tcPr>
+          <w:p>
+            <w:r>
+              <w:rPr>
+                <w:sz w:val="11"/>
+              </w:rPr>
+              <w:t>cholesterol_level</w:t>
+            </w:r>
+          </w:p>
+        </w:tc>
+        <w:tc>
+          <w:tcPr>
+            <w:tcW w:type="dxa" w:w="1440"/>
+            <w:vAlign w:val="center"/>
+          </w:tcPr>
+          <w:p>
+            <w:r>
+              <w:rPr>
+                <w:sz w:val="11"/>
+              </w:rPr>
+              <w:t>cholesterol_level</w:t>
+            </w:r>
+          </w:p>
+        </w:tc>
+        <w:tc>
+          <w:tcPr>
+            <w:tcW w:type="dxa" w:w="1440"/>
+            <w:vAlign w:val="center"/>
+          </w:tcPr>
+          <w:p>
+            <w:r>
+              <w:rPr>
+                <w:sz w:val="11"/>
+              </w:rPr>
+              <w:t>ordinal categorical</w:t>
+            </w:r>
+          </w:p>
+        </w:tc>
+        <w:tc>
+          <w:tcPr>
+            <w:tcW w:type="dxa" w:w="1440"/>
+            <w:vAlign w:val="center"/>
+          </w:tcPr>
+          <w:p>
+            <w:r>
+              <w:rPr>
+                <w:sz w:val="11"/>
+              </w:rPr>
+              <w:t>frequency bar chart</w:t>
+            </w:r>
+          </w:p>
+        </w:tc>
+        <w:tc>
+          <w:tcPr>
+            <w:tcW w:type="dxa" w:w="1440"/>
+            <w:vAlign w:val="center"/>
+          </w:tcPr>
+          <w:p>
+            <w:r>
+              <w:rPr>
+                <w:sz w:val="11"/>
+              </w:rPr>
+              <w:t>0</w:t>
+            </w:r>
+          </w:p>
+        </w:tc>
+        <w:tc>
+          <w:tcPr>
+            <w:tcW w:type="dxa" w:w="1440"/>
+            <w:vAlign w:val="center"/>
+          </w:tcPr>
+          <w:p>
+            <w:r>
+              <w:rPr>
+                <w:sz w:val="11"/>
+              </w:rPr>
+              <w:t>5</w:t>
+            </w:r>
+          </w:p>
+        </w:tc>
+      </w:tr>
+      <w:tr>
+        <w:tc>
+          <w:tcPr>
+            <w:tcW w:type="dxa" w:w="1440"/>
+            <w:vAlign w:val="center"/>
+          </w:tcPr>
+          <w:p>
+            <w:r>
+              <w:rPr>
+                <w:sz w:val="11"/>
+              </w:rPr>
+              <w:t>daily_avg_steps</w:t>
+            </w:r>
+          </w:p>
+        </w:tc>
+        <w:tc>
+          <w:tcPr>
+            <w:tcW w:type="dxa" w:w="1440"/>
+            <w:vAlign w:val="center"/>
+          </w:tcPr>
+          <w:p>
+            <w:r>
+              <w:rPr>
+                <w:sz w:val="11"/>
+              </w:rPr>
+              <w:t>daily_avg_steps</w:t>
+            </w:r>
+          </w:p>
+        </w:tc>
+        <w:tc>
+          <w:tcPr>
+            <w:tcW w:type="dxa" w:w="1440"/>
+            <w:vAlign w:val="center"/>
+          </w:tcPr>
+          <w:p>
+            <w:r>
+              <w:rPr>
+                <w:sz w:val="11"/>
+              </w:rPr>
+              <w:t>continuous numeric</w:t>
+            </w:r>
+          </w:p>
+        </w:tc>
+        <w:tc>
+          <w:tcPr>
+            <w:tcW w:type="dxa" w:w="1440"/>
+            <w:vAlign w:val="center"/>
+          </w:tcPr>
+          <w:p>
+            <w:r>
+              <w:rPr>
+                <w:sz w:val="11"/>
+              </w:rPr>
+              <w:t>histogram and boxplot</w:t>
+            </w:r>
+          </w:p>
+        </w:tc>
+        <w:tc>
+          <w:tcPr>
+            <w:tcW w:type="dxa" w:w="1440"/>
+            <w:vAlign w:val="center"/>
+          </w:tcPr>
+          <w:p>
+            <w:r>
+              <w:rPr>
+                <w:sz w:val="11"/>
+              </w:rPr>
+              <w:t>0</w:t>
+            </w:r>
+          </w:p>
+        </w:tc>
+        <w:tc>
+          <w:tcPr>
+            <w:tcW w:type="dxa" w:w="1440"/>
+            <w:vAlign w:val="center"/>
+          </w:tcPr>
+          <w:p>
+            <w:r>
+              <w:rPr>
+                <w:sz w:val="11"/>
+              </w:rPr>
+              <w:t>4914</w:t>
+            </w:r>
+          </w:p>
+        </w:tc>
+      </w:tr>
+      <w:tr>
+        <w:tc>
+          <w:tcPr>
+            <w:tcW w:type="dxa" w:w="1440"/>
+            <w:vAlign w:val="center"/>
+          </w:tcPr>
+          <w:p>
+            <w:r>
+              <w:rPr>
+                <w:sz w:val="11"/>
+              </w:rPr>
+              <w:t>age</w:t>
+            </w:r>
+          </w:p>
+        </w:tc>
+        <w:tc>
+          <w:tcPr>
+            <w:tcW w:type="dxa" w:w="1440"/>
+            <w:vAlign w:val="center"/>
+          </w:tcPr>
+          <w:p>
+            <w:r>
+              <w:rPr>
+                <w:sz w:val="11"/>
+              </w:rPr>
+              <w:t>age</w:t>
+            </w:r>
+          </w:p>
+        </w:tc>
+        <w:tc>
+          <w:tcPr>
+            <w:tcW w:type="dxa" w:w="1440"/>
+            <w:vAlign w:val="center"/>
+          </w:tcPr>
+          <w:p>
+            <w:r>
+              <w:rPr>
+                <w:sz w:val="11"/>
+              </w:rPr>
+              <w:t>continuous numeric</w:t>
+            </w:r>
+          </w:p>
+        </w:tc>
+        <w:tc>
+          <w:tcPr>
+            <w:tcW w:type="dxa" w:w="1440"/>
+            <w:vAlign w:val="center"/>
+          </w:tcPr>
+          <w:p>
+            <w:r>
+              <w:rPr>
+                <w:sz w:val="11"/>
+              </w:rPr>
+              <w:t>histogram and boxplot</w:t>
+            </w:r>
+          </w:p>
+        </w:tc>
+        <w:tc>
+          <w:tcPr>
+            <w:tcW w:type="dxa" w:w="1440"/>
+            <w:vAlign w:val="center"/>
+          </w:tcPr>
+          <w:p>
+            <w:r>
+              <w:rPr>
+                <w:sz w:val="11"/>
+              </w:rPr>
+              <w:t>0</w:t>
+            </w:r>
+          </w:p>
+        </w:tc>
+        <w:tc>
+          <w:tcPr>
+            <w:tcW w:type="dxa" w:w="1440"/>
+            <w:vAlign w:val="center"/>
+          </w:tcPr>
+          <w:p>
+            <w:r>
+              <w:rPr>
+                <w:sz w:val="11"/>
+              </w:rPr>
+              <w:t>59</w:t>
+            </w:r>
+          </w:p>
+        </w:tc>
+      </w:tr>
+      <w:tr>
+        <w:tc>
+          <w:tcPr>
+            <w:tcW w:type="dxa" w:w="1440"/>
+            <w:vAlign w:val="center"/>
+          </w:tcPr>
+          <w:p>
+            <w:r>
+              <w:rPr>
+                <w:sz w:val="11"/>
+              </w:rPr>
+              <w:t>heart_decs_history</w:t>
+            </w:r>
+          </w:p>
+        </w:tc>
+        <w:tc>
+          <w:tcPr>
+            <w:tcW w:type="dxa" w:w="1440"/>
+            <w:vAlign w:val="center"/>
+          </w:tcPr>
+          <w:p>
+            <w:r>
+              <w:rPr>
+                <w:sz w:val="11"/>
+              </w:rPr>
+              <w:t>heart_disease_history</w:t>
+            </w:r>
+          </w:p>
+        </w:tc>
+        <w:tc>
+          <w:tcPr>
+            <w:tcW w:type="dxa" w:w="1440"/>
+            <w:vAlign w:val="center"/>
+          </w:tcPr>
+          <w:p>
+            <w:r>
+              <w:rPr>
+                <w:sz w:val="11"/>
+              </w:rPr>
+              <w:t>binary categorical</w:t>
+            </w:r>
+          </w:p>
+        </w:tc>
+        <w:tc>
+          <w:tcPr>
+            <w:tcW w:type="dxa" w:w="1440"/>
+            <w:vAlign w:val="center"/>
+          </w:tcPr>
+          <w:p>
+            <w:r>
+              <w:rPr>
+                <w:sz w:val="11"/>
+              </w:rPr>
+              <w:t>frequency bar chart</w:t>
+            </w:r>
+          </w:p>
+        </w:tc>
+        <w:tc>
+          <w:tcPr>
+            <w:tcW w:type="dxa" w:w="1440"/>
+            <w:vAlign w:val="center"/>
+          </w:tcPr>
+          <w:p>
+            <w:r>
+              <w:rPr>
+                <w:sz w:val="11"/>
+              </w:rPr>
+              <w:t>0</w:t>
+            </w:r>
+          </w:p>
+        </w:tc>
+        <w:tc>
+          <w:tcPr>
+            <w:tcW w:type="dxa" w:w="1440"/>
+            <w:vAlign w:val="center"/>
+          </w:tcPr>
+          <w:p>
+            <w:r>
+              <w:rPr>
+                <w:sz w:val="11"/>
+              </w:rPr>
+              <w:t>2</w:t>
+            </w:r>
+          </w:p>
+        </w:tc>
+      </w:tr>
+      <w:tr>
+        <w:tc>
+          <w:tcPr>
+            <w:tcW w:type="dxa" w:w="1440"/>
+            <w:vAlign w:val="center"/>
+          </w:tcPr>
+          <w:p>
+            <w:r>
+              <w:rPr>
+                <w:sz w:val="11"/>
+              </w:rPr>
+              <w:t>other_major_decs_history</w:t>
+            </w:r>
+          </w:p>
+        </w:tc>
+        <w:tc>
+          <w:tcPr>
+            <w:tcW w:type="dxa" w:w="1440"/>
+            <w:vAlign w:val="center"/>
+          </w:tcPr>
+          <w:p>
+            <w:r>
+              <w:rPr>
+                <w:sz w:val="11"/>
+              </w:rPr>
+              <w:t>other_major_disease_history</w:t>
+            </w:r>
+          </w:p>
+        </w:tc>
+        <w:tc>
+          <w:tcPr>
+            <w:tcW w:type="dxa" w:w="1440"/>
+            <w:vAlign w:val="center"/>
+          </w:tcPr>
+          <w:p>
+            <w:r>
+              <w:rPr>
+                <w:sz w:val="11"/>
+              </w:rPr>
+              <w:t>binary categorical</w:t>
+            </w:r>
+          </w:p>
+        </w:tc>
+        <w:tc>
+          <w:tcPr>
+            <w:tcW w:type="dxa" w:w="1440"/>
+            <w:vAlign w:val="center"/>
+          </w:tcPr>
+          <w:p>
+            <w:r>
+              <w:rPr>
+                <w:sz w:val="11"/>
+              </w:rPr>
+              <w:t>frequency bar chart</w:t>
+            </w:r>
+          </w:p>
+        </w:tc>
+        <w:tc>
+          <w:tcPr>
+            <w:tcW w:type="dxa" w:w="1440"/>
+            <w:vAlign w:val="center"/>
+          </w:tcPr>
+          <w:p>
+            <w:r>
+              <w:rPr>
+                <w:sz w:val="11"/>
+              </w:rPr>
+              <w:t>0</w:t>
+            </w:r>
+          </w:p>
+        </w:tc>
+        <w:tc>
+          <w:tcPr>
+            <w:tcW w:type="dxa" w:w="1440"/>
+            <w:vAlign w:val="center"/>
+          </w:tcPr>
+          <w:p>
+            <w:r>
+              <w:rPr>
+                <w:sz w:val="11"/>
+              </w:rPr>
+              <w:t>2</w:t>
+            </w:r>
+          </w:p>
+        </w:tc>
+      </w:tr>
+      <w:tr>
+        <w:tc>
+          <w:tcPr>
+            <w:tcW w:type="dxa" w:w="1440"/>
+            <w:vAlign w:val="center"/>
+          </w:tcPr>
+          <w:p>
+            <w:r>
+              <w:rPr>
+                <w:sz w:val="11"/>
+              </w:rPr>
+              <w:t>Gender</w:t>
+            </w:r>
+          </w:p>
+        </w:tc>
+        <w:tc>
+          <w:tcPr>
+            <w:tcW w:type="dxa" w:w="1440"/>
+            <w:vAlign w:val="center"/>
+          </w:tcPr>
+          <w:p>
+            <w:r>
+              <w:rPr>
+                <w:sz w:val="11"/>
+              </w:rPr>
+              <w:t>Gender</w:t>
+            </w:r>
+          </w:p>
+        </w:tc>
+        <w:tc>
+          <w:tcPr>
+            <w:tcW w:type="dxa" w:w="1440"/>
+            <w:vAlign w:val="center"/>
+          </w:tcPr>
+          <w:p>
+            <w:r>
+              <w:rPr>
+                <w:sz w:val="11"/>
+              </w:rPr>
+              <w:t>nominal categorical</w:t>
+            </w:r>
+          </w:p>
+        </w:tc>
+        <w:tc>
+          <w:tcPr>
+            <w:tcW w:type="dxa" w:w="1440"/>
+            <w:vAlign w:val="center"/>
+          </w:tcPr>
+          <w:p>
+            <w:r>
+              <w:rPr>
+                <w:sz w:val="11"/>
+              </w:rPr>
+              <w:t>frequency bar chart</w:t>
+            </w:r>
+          </w:p>
+        </w:tc>
+        <w:tc>
+          <w:tcPr>
+            <w:tcW w:type="dxa" w:w="1440"/>
+            <w:vAlign w:val="center"/>
+          </w:tcPr>
+          <w:p>
+            <w:r>
+              <w:rPr>
+                <w:sz w:val="11"/>
+              </w:rPr>
+              <w:t>0</w:t>
+            </w:r>
+          </w:p>
+        </w:tc>
+        <w:tc>
+          <w:tcPr>
+            <w:tcW w:type="dxa" w:w="1440"/>
+            <w:vAlign w:val="center"/>
+          </w:tcPr>
+          <w:p>
+            <w:r>
+              <w:rPr>
+                <w:sz w:val="11"/>
+              </w:rPr>
+              <w:t>2</w:t>
+            </w:r>
+          </w:p>
+        </w:tc>
+      </w:tr>
+      <w:tr>
+        <w:tc>
+          <w:tcPr>
+            <w:tcW w:type="dxa" w:w="1440"/>
+            <w:vAlign w:val="center"/>
+          </w:tcPr>
+          <w:p>
+            <w:r>
+              <w:rPr>
+                <w:sz w:val="11"/>
+              </w:rPr>
+              <w:t>avg_glucose_level</w:t>
+            </w:r>
+          </w:p>
+        </w:tc>
+        <w:tc>
+          <w:tcPr>
+            <w:tcW w:type="dxa" w:w="1440"/>
+            <w:vAlign w:val="center"/>
+          </w:tcPr>
+          <w:p>
+            <w:r>
+              <w:rPr>
+                <w:sz w:val="11"/>
+              </w:rPr>
+              <w:t>avg_glucose_level</w:t>
+            </w:r>
+          </w:p>
+        </w:tc>
+        <w:tc>
+          <w:tcPr>
+            <w:tcW w:type="dxa" w:w="1440"/>
+            <w:vAlign w:val="center"/>
+          </w:tcPr>
+          <w:p>
+            <w:r>
+              <w:rPr>
+                <w:sz w:val="11"/>
+              </w:rPr>
+              <w:t>continuous numeric</w:t>
+            </w:r>
+          </w:p>
+        </w:tc>
+        <w:tc>
+          <w:tcPr>
+            <w:tcW w:type="dxa" w:w="1440"/>
+            <w:vAlign w:val="center"/>
+          </w:tcPr>
+          <w:p>
+            <w:r>
+              <w:rPr>
+                <w:sz w:val="11"/>
+              </w:rPr>
+              <w:t>histogram and boxplot</w:t>
+            </w:r>
+          </w:p>
+        </w:tc>
+        <w:tc>
+          <w:tcPr>
+            <w:tcW w:type="dxa" w:w="1440"/>
+            <w:vAlign w:val="center"/>
+          </w:tcPr>
+          <w:p>
+            <w:r>
+              <w:rPr>
+                <w:sz w:val="11"/>
+              </w:rPr>
+              <w:t>0</w:t>
+            </w:r>
+          </w:p>
+        </w:tc>
+        <w:tc>
+          <w:tcPr>
+            <w:tcW w:type="dxa" w:w="1440"/>
+            <w:vAlign w:val="center"/>
+          </w:tcPr>
+          <w:p>
+            <w:r>
+              <w:rPr>
+                <w:sz w:val="11"/>
+              </w:rPr>
+              <w:t>221</w:t>
+            </w:r>
+          </w:p>
+        </w:tc>
+      </w:tr>
+      <w:tr>
+        <w:tc>
+          <w:tcPr>
+            <w:tcW w:type="dxa" w:w="1440"/>
+            <w:vAlign w:val="center"/>
+          </w:tcPr>
+          <w:p>
+            <w:r>
+              <w:rPr>
+                <w:sz w:val="11"/>
+              </w:rPr>
+              <w:t>bmi</w:t>
+            </w:r>
+          </w:p>
+        </w:tc>
+        <w:tc>
+          <w:tcPr>
+            <w:tcW w:type="dxa" w:w="1440"/>
+            <w:vAlign w:val="center"/>
+          </w:tcPr>
+          <w:p>
+            <w:r>
+              <w:rPr>
+                <w:sz w:val="11"/>
+              </w:rPr>
+              <w:t>bmi</w:t>
+            </w:r>
+          </w:p>
+        </w:tc>
+        <w:tc>
+          <w:tcPr>
+            <w:tcW w:type="dxa" w:w="1440"/>
+            <w:vAlign w:val="center"/>
+          </w:tcPr>
+          <w:p>
+            <w:r>
+              <w:rPr>
+                <w:sz w:val="11"/>
+              </w:rPr>
+              <w:t>continuous numeric</w:t>
+            </w:r>
+          </w:p>
+        </w:tc>
+        <w:tc>
+          <w:tcPr>
+            <w:tcW w:type="dxa" w:w="1440"/>
+            <w:vAlign w:val="center"/>
+          </w:tcPr>
+          <w:p>
+            <w:r>
+              <w:rPr>
+                <w:sz w:val="11"/>
+              </w:rPr>
+              <w:t>histogram and boxplot</w:t>
+            </w:r>
+          </w:p>
+        </w:tc>
+        <w:tc>
+          <w:tcPr>
+            <w:tcW w:type="dxa" w:w="1440"/>
+            <w:vAlign w:val="center"/>
+          </w:tcPr>
+          <w:p>
+            <w:r>
+              <w:rPr>
+                <w:sz w:val="11"/>
+              </w:rPr>
+              <w:t>990</w:t>
+            </w:r>
+          </w:p>
+        </w:tc>
+        <w:tc>
+          <w:tcPr>
+            <w:tcW w:type="dxa" w:w="1440"/>
+            <w:vAlign w:val="center"/>
+          </w:tcPr>
+          <w:p>
+            <w:r>
+              <w:rPr>
+                <w:sz w:val="11"/>
+              </w:rPr>
+              <w:t>465</w:t>
+            </w:r>
+          </w:p>
+        </w:tc>
+      </w:tr>
+      <w:tr>
+        <w:tc>
+          <w:tcPr>
+            <w:tcW w:type="dxa" w:w="1440"/>
+            <w:vAlign w:val="center"/>
+          </w:tcPr>
+          <w:p>
+            <w:r>
+              <w:rPr>
+                <w:sz w:val="11"/>
+              </w:rPr>
+              <w:t>smoking_status</w:t>
+            </w:r>
+          </w:p>
+        </w:tc>
+        <w:tc>
+          <w:tcPr>
+            <w:tcW w:type="dxa" w:w="1440"/>
+            <w:vAlign w:val="center"/>
+          </w:tcPr>
+          <w:p>
+            <w:r>
+              <w:rPr>
+                <w:sz w:val="11"/>
+              </w:rPr>
+              <w:t>smoking_status</w:t>
+            </w:r>
+          </w:p>
+        </w:tc>
+        <w:tc>
+          <w:tcPr>
+            <w:tcW w:type="dxa" w:w="1440"/>
+            <w:vAlign w:val="center"/>
+          </w:tcPr>
+          <w:p>
+            <w:r>
+              <w:rPr>
+                <w:sz w:val="11"/>
+              </w:rPr>
+              <w:t>nominal categorical</w:t>
+            </w:r>
+          </w:p>
+        </w:tc>
+        <w:tc>
+          <w:tcPr>
+            <w:tcW w:type="dxa" w:w="1440"/>
+            <w:vAlign w:val="center"/>
+          </w:tcPr>
+          <w:p>
+            <w:r>
+              <w:rPr>
+                <w:sz w:val="11"/>
+              </w:rPr>
+              <w:t>frequency bar chart</w:t>
+            </w:r>
+          </w:p>
+        </w:tc>
+        <w:tc>
+          <w:tcPr>
+            <w:tcW w:type="dxa" w:w="1440"/>
+            <w:vAlign w:val="center"/>
+          </w:tcPr>
+          <w:p>
+            <w:r>
+              <w:rPr>
+                <w:sz w:val="11"/>
+              </w:rPr>
+              <w:t>0</w:t>
+            </w:r>
+          </w:p>
+        </w:tc>
+        <w:tc>
+          <w:tcPr>
+            <w:tcW w:type="dxa" w:w="1440"/>
+            <w:vAlign w:val="center"/>
+          </w:tcPr>
+          <w:p>
+            <w:r>
+              <w:rPr>
+                <w:sz w:val="11"/>
+              </w:rPr>
+              <w:t>4</w:t>
+            </w:r>
+          </w:p>
+        </w:tc>
+      </w:tr>
+      <w:tr>
+        <w:tc>
+          <w:tcPr>
+            <w:tcW w:type="dxa" w:w="1440"/>
+            <w:vAlign w:val="center"/>
+          </w:tcPr>
+          <w:p>
+            <w:r>
+              <w:rPr>
+                <w:sz w:val="11"/>
+              </w:rPr>
+              <w:t>Year_last_admitted</w:t>
+            </w:r>
+          </w:p>
+        </w:tc>
+        <w:tc>
+          <w:tcPr>
+            <w:tcW w:type="dxa" w:w="1440"/>
+            <w:vAlign w:val="center"/>
+          </w:tcPr>
+          <w:p>
+            <w:r>
+              <w:rPr>
+                <w:sz w:val="11"/>
+              </w:rPr>
+              <w:t>Year_last_admitted</w:t>
+            </w:r>
+          </w:p>
+        </w:tc>
+        <w:tc>
+          <w:tcPr>
+            <w:tcW w:type="dxa" w:w="1440"/>
+            <w:vAlign w:val="center"/>
+          </w:tcPr>
+          <w:p>
+            <w:r>
+              <w:rPr>
+                <w:sz w:val="11"/>
+              </w:rPr>
+              <w:t>numeric with structural missingness</w:t>
+            </w:r>
+          </w:p>
+        </w:tc>
+        <w:tc>
+          <w:tcPr>
+            <w:tcW w:type="dxa" w:w="1440"/>
+            <w:vAlign w:val="center"/>
+          </w:tcPr>
+          <w:p>
+            <w:r>
+              <w:rPr>
+                <w:sz w:val="11"/>
+              </w:rPr>
+              <w:t>frequency bar chart</w:t>
+            </w:r>
+          </w:p>
+        </w:tc>
+        <w:tc>
+          <w:tcPr>
+            <w:tcW w:type="dxa" w:w="1440"/>
+            <w:vAlign w:val="center"/>
+          </w:tcPr>
+          <w:p>
+            <w:r>
+              <w:rPr>
+                <w:sz w:val="11"/>
+              </w:rPr>
+              <w:t>11881</w:t>
+            </w:r>
+          </w:p>
+        </w:tc>
+        <w:tc>
+          <w:tcPr>
+            <w:tcW w:type="dxa" w:w="1440"/>
+            <w:vAlign w:val="center"/>
+          </w:tcPr>
+          <w:p>
+            <w:r>
+              <w:rPr>
+                <w:sz w:val="11"/>
+              </w:rPr>
+              <w:t>29</w:t>
+            </w:r>
+          </w:p>
+        </w:tc>
+      </w:tr>
+      <w:tr>
+        <w:tc>
+          <w:tcPr>
+            <w:tcW w:type="dxa" w:w="1440"/>
+            <w:vAlign w:val="center"/>
+          </w:tcPr>
+          <w:p>
+            <w:r>
+              <w:rPr>
+                <w:sz w:val="11"/>
+              </w:rPr>
+              <w:t>Location</w:t>
+            </w:r>
+          </w:p>
+        </w:tc>
+        <w:tc>
+          <w:tcPr>
+            <w:tcW w:type="dxa" w:w="1440"/>
+            <w:vAlign w:val="center"/>
+          </w:tcPr>
+          <w:p>
+            <w:r>
+              <w:rPr>
+                <w:sz w:val="11"/>
+              </w:rPr>
+              <w:t>Location</w:t>
+            </w:r>
+          </w:p>
+        </w:tc>
+        <w:tc>
+          <w:tcPr>
+            <w:tcW w:type="dxa" w:w="1440"/>
+            <w:vAlign w:val="center"/>
+          </w:tcPr>
+          <w:p>
+            <w:r>
+              <w:rPr>
+                <w:sz w:val="11"/>
+              </w:rPr>
+              <w:t>nominal categorical</w:t>
+            </w:r>
+          </w:p>
+        </w:tc>
+        <w:tc>
+          <w:tcPr>
+            <w:tcW w:type="dxa" w:w="1440"/>
+            <w:vAlign w:val="center"/>
+          </w:tcPr>
+          <w:p>
+            <w:r>
+              <w:rPr>
+                <w:sz w:val="11"/>
+              </w:rPr>
+              <w:t>frequency bar chart</w:t>
+            </w:r>
+          </w:p>
+        </w:tc>
+        <w:tc>
+          <w:tcPr>
+            <w:tcW w:type="dxa" w:w="1440"/>
+            <w:vAlign w:val="center"/>
+          </w:tcPr>
+          <w:p>
+            <w:r>
+              <w:rPr>
+                <w:sz w:val="11"/>
+              </w:rPr>
+              <w:t>0</w:t>
+            </w:r>
+          </w:p>
+        </w:tc>
+        <w:tc>
+          <w:tcPr>
+            <w:tcW w:type="dxa" w:w="1440"/>
+            <w:vAlign w:val="center"/>
+          </w:tcPr>
+          <w:p>
+            <w:r>
+              <w:rPr>
+                <w:sz w:val="11"/>
+              </w:rPr>
+              <w:t>15</w:t>
+            </w:r>
+          </w:p>
+        </w:tc>
+      </w:tr>
+      <w:tr>
+        <w:tc>
+          <w:tcPr>
+            <w:tcW w:type="dxa" w:w="1440"/>
+            <w:vAlign w:val="center"/>
+          </w:tcPr>
+          <w:p>
+            <w:r>
+              <w:rPr>
+                <w:sz w:val="11"/>
+              </w:rPr>
+              <w:t>weight</w:t>
+            </w:r>
+          </w:p>
+        </w:tc>
+        <w:tc>
+          <w:tcPr>
+            <w:tcW w:type="dxa" w:w="1440"/>
+            <w:vAlign w:val="center"/>
+          </w:tcPr>
+          <w:p>
+            <w:r>
+              <w:rPr>
+                <w:sz w:val="11"/>
+              </w:rPr>
+              <w:t>weight</w:t>
+            </w:r>
+          </w:p>
+        </w:tc>
+        <w:tc>
+          <w:tcPr>
+            <w:tcW w:type="dxa" w:w="1440"/>
+            <w:vAlign w:val="center"/>
+          </w:tcPr>
+          <w:p>
+            <w:r>
+              <w:rPr>
+                <w:sz w:val="11"/>
+              </w:rPr>
+              <w:t>continuous numeric</w:t>
+            </w:r>
+          </w:p>
+        </w:tc>
+        <w:tc>
+          <w:tcPr>
+            <w:tcW w:type="dxa" w:w="1440"/>
+            <w:vAlign w:val="center"/>
+          </w:tcPr>
+          <w:p>
+            <w:r>
+              <w:rPr>
+                <w:sz w:val="11"/>
+              </w:rPr>
+              <w:t>histogram and boxplot</w:t>
+            </w:r>
+          </w:p>
+        </w:tc>
+        <w:tc>
+          <w:tcPr>
+            <w:tcW w:type="dxa" w:w="1440"/>
+            <w:vAlign w:val="center"/>
+          </w:tcPr>
+          <w:p>
+            <w:r>
+              <w:rPr>
+                <w:sz w:val="11"/>
+              </w:rPr>
+              <w:t>0</w:t>
+            </w:r>
+          </w:p>
+        </w:tc>
+        <w:tc>
+          <w:tcPr>
+            <w:tcW w:type="dxa" w:w="1440"/>
+            <w:vAlign w:val="center"/>
+          </w:tcPr>
+          <w:p>
+            <w:r>
+              <w:rPr>
+                <w:sz w:val="11"/>
+              </w:rPr>
+              <w:t>45</w:t>
+            </w:r>
+          </w:p>
+        </w:tc>
+      </w:tr>
+      <w:tr>
+        <w:tc>
+          <w:tcPr>
+            <w:tcW w:type="dxa" w:w="1440"/>
+            <w:vAlign w:val="center"/>
+          </w:tcPr>
+          <w:p>
+            <w:r>
+              <w:rPr>
+                <w:sz w:val="11"/>
+              </w:rPr>
+              <w:t>covered_by_any_other_company</w:t>
+            </w:r>
+          </w:p>
+        </w:tc>
+        <w:tc>
+          <w:tcPr>
+            <w:tcW w:type="dxa" w:w="1440"/>
+            <w:vAlign w:val="center"/>
+          </w:tcPr>
+          <w:p>
+            <w:r>
+              <w:rPr>
+                <w:sz w:val="11"/>
+              </w:rPr>
+              <w:t>covered_by_any_other_company</w:t>
+            </w:r>
+          </w:p>
+        </w:tc>
+        <w:tc>
+          <w:tcPr>
+            <w:tcW w:type="dxa" w:w="1440"/>
+            <w:vAlign w:val="center"/>
+          </w:tcPr>
+          <w:p>
+            <w:r>
+              <w:rPr>
+                <w:sz w:val="11"/>
+              </w:rPr>
+              <w:t>nominal categorical</w:t>
+            </w:r>
+          </w:p>
+        </w:tc>
+        <w:tc>
+          <w:tcPr>
+            <w:tcW w:type="dxa" w:w="1440"/>
+            <w:vAlign w:val="center"/>
+          </w:tcPr>
+          <w:p>
+            <w:r>
+              <w:rPr>
+                <w:sz w:val="11"/>
+              </w:rPr>
+              <w:t>frequency bar chart</w:t>
+            </w:r>
+          </w:p>
+        </w:tc>
+        <w:tc>
+          <w:tcPr>
+            <w:tcW w:type="dxa" w:w="1440"/>
+            <w:vAlign w:val="center"/>
+          </w:tcPr>
+          <w:p>
+            <w:r>
+              <w:rPr>
+                <w:sz w:val="11"/>
+              </w:rPr>
+              <w:t>0</w:t>
+            </w:r>
+          </w:p>
+        </w:tc>
+        <w:tc>
+          <w:tcPr>
+            <w:tcW w:type="dxa" w:w="1440"/>
+            <w:vAlign w:val="center"/>
+          </w:tcPr>
+          <w:p>
+            <w:r>
+              <w:rPr>
+                <w:sz w:val="11"/>
+              </w:rPr>
+              <w:t>2</w:t>
+            </w:r>
+          </w:p>
+        </w:tc>
+      </w:tr>
+      <w:tr>
+        <w:tc>
+          <w:tcPr>
+            <w:tcW w:type="dxa" w:w="1440"/>
+            <w:vAlign w:val="center"/>
+          </w:tcPr>
+          <w:p>
+            <w:r>
+              <w:rPr>
+                <w:sz w:val="11"/>
+              </w:rPr>
+              <w:t>Alcohol</w:t>
+            </w:r>
+          </w:p>
+        </w:tc>
+        <w:tc>
+          <w:tcPr>
+            <w:tcW w:type="dxa" w:w="1440"/>
+            <w:vAlign w:val="center"/>
+          </w:tcPr>
+          <w:p>
+            <w:r>
+              <w:rPr>
+                <w:sz w:val="11"/>
+              </w:rPr>
+              <w:t>Alcohol</w:t>
+            </w:r>
+          </w:p>
+        </w:tc>
+        <w:tc>
+          <w:tcPr>
+            <w:tcW w:type="dxa" w:w="1440"/>
+            <w:vAlign w:val="center"/>
+          </w:tcPr>
+          <w:p>
+            <w:r>
+              <w:rPr>
+                <w:sz w:val="11"/>
+              </w:rPr>
+              <w:t>nominal categorical</w:t>
+            </w:r>
+          </w:p>
+        </w:tc>
+        <w:tc>
+          <w:tcPr>
+            <w:tcW w:type="dxa" w:w="1440"/>
+            <w:vAlign w:val="center"/>
+          </w:tcPr>
+          <w:p>
+            <w:r>
+              <w:rPr>
+                <w:sz w:val="11"/>
+              </w:rPr>
+              <w:t>frequency bar chart</w:t>
+            </w:r>
+          </w:p>
+        </w:tc>
+        <w:tc>
+          <w:tcPr>
+            <w:tcW w:type="dxa" w:w="1440"/>
+            <w:vAlign w:val="center"/>
+          </w:tcPr>
+          <w:p>
+            <w:r>
+              <w:rPr>
+                <w:sz w:val="11"/>
+              </w:rPr>
+              <w:t>0</w:t>
+            </w:r>
+          </w:p>
+        </w:tc>
+        <w:tc>
+          <w:tcPr>
+            <w:tcW w:type="dxa" w:w="1440"/>
+            <w:vAlign w:val="center"/>
+          </w:tcPr>
+          <w:p>
+            <w:r>
+              <w:rPr>
+                <w:sz w:val="11"/>
+              </w:rPr>
+              <w:t>3</w:t>
+            </w:r>
+          </w:p>
+        </w:tc>
+      </w:tr>
+      <w:tr>
+        <w:tc>
+          <w:tcPr>
+            <w:tcW w:type="dxa" w:w="1440"/>
+            <w:vAlign w:val="center"/>
+          </w:tcPr>
+          <w:p>
+            <w:r>
+              <w:rPr>
+                <w:sz w:val="11"/>
+              </w:rPr>
+              <w:t>exercise</w:t>
+            </w:r>
+          </w:p>
+        </w:tc>
+        <w:tc>
+          <w:tcPr>
+            <w:tcW w:type="dxa" w:w="1440"/>
+            <w:vAlign w:val="center"/>
+          </w:tcPr>
+          <w:p>
+            <w:r>
+              <w:rPr>
+                <w:sz w:val="11"/>
+              </w:rPr>
+              <w:t>exercise</w:t>
+            </w:r>
+          </w:p>
+        </w:tc>
+        <w:tc>
+          <w:tcPr>
+            <w:tcW w:type="dxa" w:w="1440"/>
+            <w:vAlign w:val="center"/>
+          </w:tcPr>
+          <w:p>
+            <w:r>
+              <w:rPr>
+                <w:sz w:val="11"/>
+              </w:rPr>
+              <w:t>nominal categorical</w:t>
+            </w:r>
+          </w:p>
+        </w:tc>
+        <w:tc>
+          <w:tcPr>
+            <w:tcW w:type="dxa" w:w="1440"/>
+            <w:vAlign w:val="center"/>
+          </w:tcPr>
+          <w:p>
+            <w:r>
+              <w:rPr>
+                <w:sz w:val="11"/>
+              </w:rPr>
+              <w:t>frequency bar chart</w:t>
+            </w:r>
+          </w:p>
+        </w:tc>
+        <w:tc>
+          <w:tcPr>
+            <w:tcW w:type="dxa" w:w="1440"/>
+            <w:vAlign w:val="center"/>
+          </w:tcPr>
+          <w:p>
+            <w:r>
+              <w:rPr>
+                <w:sz w:val="11"/>
+              </w:rPr>
+              <w:t>0</w:t>
+            </w:r>
+          </w:p>
+        </w:tc>
+        <w:tc>
+          <w:tcPr>
+            <w:tcW w:type="dxa" w:w="1440"/>
+            <w:vAlign w:val="center"/>
+          </w:tcPr>
+          <w:p>
+            <w:r>
+              <w:rPr>
+                <w:sz w:val="11"/>
+              </w:rPr>
+              <w:t>3</w:t>
+            </w:r>
+          </w:p>
+        </w:tc>
+      </w:tr>
+      <w:tr>
+        <w:tc>
+          <w:tcPr>
+            <w:tcW w:type="dxa" w:w="1440"/>
+            <w:vAlign w:val="center"/>
+          </w:tcPr>
+          <w:p>
+            <w:r>
+              <w:rPr>
+                <w:sz w:val="11"/>
+              </w:rPr>
+              <w:t>weight_change_in_last_one_year</w:t>
+            </w:r>
+          </w:p>
+        </w:tc>
+        <w:tc>
+          <w:tcPr>
+            <w:tcW w:type="dxa" w:w="1440"/>
+            <w:vAlign w:val="center"/>
+          </w:tcPr>
+          <w:p>
+            <w:r>
+              <w:rPr>
+                <w:sz w:val="11"/>
+              </w:rPr>
+              <w:t>weight_change_in_last_one_year</w:t>
+            </w:r>
+          </w:p>
+        </w:tc>
+        <w:tc>
+          <w:tcPr>
+            <w:tcW w:type="dxa" w:w="1440"/>
+            <w:vAlign w:val="center"/>
+          </w:tcPr>
+          <w:p>
+            <w:r>
+              <w:rPr>
+                <w:sz w:val="11"/>
+              </w:rPr>
+              <w:t>ordinal discrete numeric</w:t>
+            </w:r>
+          </w:p>
+        </w:tc>
+        <w:tc>
+          <w:tcPr>
+            <w:tcW w:type="dxa" w:w="1440"/>
+            <w:vAlign w:val="center"/>
+          </w:tcPr>
+          <w:p>
+            <w:r>
+              <w:rPr>
+                <w:sz w:val="11"/>
+              </w:rPr>
+              <w:t>frequency bar chart</w:t>
+            </w:r>
+          </w:p>
+        </w:tc>
+        <w:tc>
+          <w:tcPr>
+            <w:tcW w:type="dxa" w:w="1440"/>
+            <w:vAlign w:val="center"/>
+          </w:tcPr>
+          <w:p>
+            <w:r>
+              <w:rPr>
+                <w:sz w:val="11"/>
+              </w:rPr>
+              <w:t>0</w:t>
+            </w:r>
+          </w:p>
+        </w:tc>
+        <w:tc>
+          <w:tcPr>
+            <w:tcW w:type="dxa" w:w="1440"/>
+            <w:vAlign w:val="center"/>
+          </w:tcPr>
+          <w:p>
+            <w:r>
+              <w:rPr>
+                <w:sz w:val="11"/>
+              </w:rPr>
+              <w:t>7</w:t>
+            </w:r>
+          </w:p>
+        </w:tc>
+      </w:tr>
+      <w:tr>
+        <w:tc>
+          <w:tcPr>
+            <w:tcW w:type="dxa" w:w="1440"/>
+            <w:vAlign w:val="center"/>
+          </w:tcPr>
+          <w:p>
+            <w:r>
+              <w:rPr>
+                <w:sz w:val="11"/>
+              </w:rPr>
+              <w:t>fat_percentage</w:t>
+            </w:r>
+          </w:p>
+        </w:tc>
+        <w:tc>
+          <w:tcPr>
+            <w:tcW w:type="dxa" w:w="1440"/>
+            <w:vAlign w:val="center"/>
+          </w:tcPr>
+          <w:p>
+            <w:r>
+              <w:rPr>
+                <w:sz w:val="11"/>
+              </w:rPr>
+              <w:t>fat_percentage</w:t>
+            </w:r>
+          </w:p>
+        </w:tc>
+        <w:tc>
+          <w:tcPr>
+            <w:tcW w:type="dxa" w:w="1440"/>
+            <w:vAlign w:val="center"/>
+          </w:tcPr>
+          <w:p>
+            <w:r>
+              <w:rPr>
+                <w:sz w:val="11"/>
+              </w:rPr>
+              <w:t>continuous numeric</w:t>
+            </w:r>
+          </w:p>
+        </w:tc>
+        <w:tc>
+          <w:tcPr>
+            <w:tcW w:type="dxa" w:w="1440"/>
+            <w:vAlign w:val="center"/>
+          </w:tcPr>
+          <w:p>
+            <w:r>
+              <w:rPr>
+                <w:sz w:val="11"/>
+              </w:rPr>
+              <w:t>histogram and boxplot</w:t>
+            </w:r>
+          </w:p>
+        </w:tc>
+        <w:tc>
+          <w:tcPr>
+            <w:tcW w:type="dxa" w:w="1440"/>
+            <w:vAlign w:val="center"/>
+          </w:tcPr>
+          <w:p>
+            <w:r>
+              <w:rPr>
+                <w:sz w:val="11"/>
+              </w:rPr>
+              <w:t>0</w:t>
+            </w:r>
+          </w:p>
+        </w:tc>
+        <w:tc>
+          <w:tcPr>
+            <w:tcW w:type="dxa" w:w="1440"/>
+            <w:vAlign w:val="center"/>
+          </w:tcPr>
+          <w:p>
+            <w:r>
+              <w:rPr>
+                <w:sz w:val="11"/>
+              </w:rPr>
+              <w:t>32</w:t>
+            </w:r>
+          </w:p>
+        </w:tc>
+      </w:tr>
+      <w:tr>
+        <w:tc>
+          <w:tcPr>
+            <w:tcW w:type="dxa" w:w="1440"/>
+            <w:vAlign w:val="center"/>
+          </w:tcPr>
+          <w:p>
+            <w:r>
+              <w:rPr>
+                <w:sz w:val="11"/>
+              </w:rPr>
+              <w:t>insurance_cost</w:t>
+            </w:r>
+          </w:p>
+        </w:tc>
+        <w:tc>
+          <w:tcPr>
+            <w:tcW w:type="dxa" w:w="1440"/>
+            <w:vAlign w:val="center"/>
+          </w:tcPr>
+          <w:p>
+            <w:r>
+              <w:rPr>
+                <w:sz w:val="11"/>
+              </w:rPr>
+              <w:t>insurance_cost</w:t>
+            </w:r>
+          </w:p>
+        </w:tc>
+        <w:tc>
+          <w:tcPr>
+            <w:tcW w:type="dxa" w:w="1440"/>
+            <w:vAlign w:val="center"/>
+          </w:tcPr>
+          <w:p>
+            <w:r>
+              <w:rPr>
+                <w:sz w:val="11"/>
+              </w:rPr>
+              <w:t>discrete numeric quote grid / regression target</w:t>
+            </w:r>
+          </w:p>
+        </w:tc>
+        <w:tc>
+          <w:tcPr>
+            <w:tcW w:type="dxa" w:w="1440"/>
+            <w:vAlign w:val="center"/>
+          </w:tcPr>
+          <w:p>
+            <w:r>
+              <w:rPr>
+                <w:sz w:val="11"/>
+              </w:rPr>
+              <w:t>target histogram with KDE</w:t>
+            </w:r>
+          </w:p>
+        </w:tc>
+        <w:tc>
+          <w:tcPr>
+            <w:tcW w:type="dxa" w:w="1440"/>
+            <w:vAlign w:val="center"/>
+          </w:tcPr>
+          <w:p>
+            <w:r>
+              <w:rPr>
+                <w:sz w:val="11"/>
+              </w:rPr>
+              <w:t>0</w:t>
+            </w:r>
+          </w:p>
+        </w:tc>
+        <w:tc>
+          <w:tcPr>
+            <w:tcW w:type="dxa" w:w="1440"/>
+            <w:vAlign w:val="center"/>
+          </w:tcPr>
+          <w:p>
+            <w:r>
+              <w:rPr>
+                <w:sz w:val="11"/>
+              </w:rPr>
+              <w:t>54</w:t>
+            </w:r>
+          </w:p>
+        </w:tc>
+      </w:tr>
+    </w:tbl>
+    <w:p/>
+    <w:p>
+      <w:pPr>
+        <w:pStyle w:val="Heading3"/>
+      </w:pPr>
+      <w:r>
+        <w:t>Univariate plot: applicant_id</w:t>
+      </w:r>
+    </w:p>
+    <w:p>
+      <w:pPr>
+        <w:jc w:val="center"/>
+      </w:pPr>
+      <w:r>
+        <w:drawing>
+          <wp:inline xmlns:a="http://schemas.openxmlformats.org/drawingml/2006/main" xmlns:pic="http://schemas.openxmlformats.org/drawingml/2006/picture">
+            <wp:extent cx="5303520" cy="3049106"/>
+            <wp:docPr id="15" name="Picture 15"/>
+            <wp:cNvGraphicFramePr>
+              <a:graphicFrameLocks noChangeAspect="1"/>
+            </wp:cNvGraphicFramePr>
+            <a:graphic>
+              <a:graphicData uri="http://schemas.openxmlformats.org/drawingml/2006/picture">
+                <pic:pic>
+                  <pic:nvPicPr>
+                    <pic:cNvPr id="0" name="univariate_applicant_id.png"/>
+                    <pic:cNvPicPr/>
+                  </pic:nvPicPr>
+                  <pic:blipFill>
+                    <a:blip r:embed="rId24"/>
+                    <a:stretch>
+                      <a:fillRect/>
+                    </a:stretch>
+                  </pic:blipFill>
+                  <pic:spPr>
+                    <a:xfrm>
+                      <a:off x="0" y="0"/>
+                      <a:ext cx="5303520" cy="3049106"/>
+                    </a:xfrm>
+                    <a:prstGeom prst="rect"/>
+                  </pic:spPr>
+                </pic:pic>
+              </a:graphicData>
+            </a:graphic>
+          </wp:inline>
+        </w:drawing>
+      </w:r>
+    </w:p>
+    <w:p>
+      <w:pPr>
+        <w:jc w:val="center"/>
+      </w:pPr>
+      <w:r>
+        <w:rPr>
+          <w:i/>
+          <w:color w:val="6B7280"/>
+          <w:sz w:val="17"/>
+        </w:rPr>
+        <w:t>Univariate distribution or frequency for applicant_id.</w:t>
+      </w:r>
+    </w:p>
+    <w:p>
+      <w:r>
+        <w:rPr>
+          <w:b/>
+        </w:rPr>
+        <w:t xml:space="preserve">Technical interpretation: </w:t>
+      </w:r>
+      <w:r>
+        <w:t>`applicant_id` has 25,000 unique values across 25,000 rows and 0 duplicate ID values.</w:t>
+      </w:r>
+    </w:p>
+    <w:p>
+      <w:r>
+        <w:rPr>
+          <w:b/>
+        </w:rPr>
+        <w:t xml:space="preserve">Business interpretation: </w:t>
+      </w:r>
+      <w:r>
+        <w:t>The field is useful for audit traceability only and is excluded from modeling and app input because an identifier does not generalize to new applicants.</w:t>
+      </w:r>
+    </w:p>
+    <w:p>
+      <w:pPr>
+        <w:pStyle w:val="Heading3"/>
+      </w:pPr>
+      <w:r>
+        <w:t>Univariate plot: years_of_insurance_with_us</w:t>
+      </w:r>
+    </w:p>
+    <w:p>
+      <w:pPr>
+        <w:jc w:val="center"/>
+      </w:pPr>
+      <w:r>
+        <w:drawing>
+          <wp:inline xmlns:a="http://schemas.openxmlformats.org/drawingml/2006/main" xmlns:pic="http://schemas.openxmlformats.org/drawingml/2006/picture">
+            <wp:extent cx="5303520" cy="2916936"/>
+            <wp:docPr id="16" name="Picture 16"/>
+            <wp:cNvGraphicFramePr>
+              <a:graphicFrameLocks noChangeAspect="1"/>
+            </wp:cNvGraphicFramePr>
+            <a:graphic>
+              <a:graphicData uri="http://schemas.openxmlformats.org/drawingml/2006/picture">
+                <pic:pic>
+                  <pic:nvPicPr>
+                    <pic:cNvPr id="0" name="univariate_years_of_insurance_with_us.png"/>
+                    <pic:cNvPicPr/>
+                  </pic:nvPicPr>
+                  <pic:blipFill>
+                    <a:blip r:embed="rId25"/>
+                    <a:stretch>
+                      <a:fillRect/>
+                    </a:stretch>
+                  </pic:blipFill>
+                  <pic:spPr>
+                    <a:xfrm>
+                      <a:off x="0" y="0"/>
+                      <a:ext cx="5303520" cy="2916936"/>
+                    </a:xfrm>
+                    <a:prstGeom prst="rect"/>
+                  </pic:spPr>
+                </pic:pic>
+              </a:graphicData>
+            </a:graphic>
+          </wp:inline>
+        </w:drawing>
+      </w:r>
+    </w:p>
+    <w:p>
+      <w:pPr>
+        <w:jc w:val="center"/>
+      </w:pPr>
+      <w:r>
+        <w:rPr>
+          <w:i/>
+          <w:color w:val="6B7280"/>
+          <w:sz w:val="17"/>
+        </w:rPr>
+        <w:t>Univariate distribution or frequency for years_of_insurance_with_us.</w:t>
+      </w:r>
+    </w:p>
+    <w:p>
+      <w:r>
+        <w:rPr>
+          <w:b/>
+        </w:rPr>
+        <w:t xml:space="preserve">Technical interpretation: </w:t>
+      </w:r>
+      <w:r>
+        <w:t>`years_of_insurance_with_us` has 9 non-missing levels and 0 missing values; the most frequent level is `3` at 12.0% of rows.</w:t>
+      </w:r>
+    </w:p>
+    <w:p>
+      <w:r>
+        <w:rPr>
+          <w:b/>
+        </w:rPr>
+        <w:t xml:space="preserve">Business interpretation: </w:t>
+      </w:r>
+      <w:r>
+        <w:t>The frequency view checks whether `years_of_insurance_with_us` is balanced enough for EDA and downstream encoding; the preprocessing action is: validate type, preserve for EDA, and feed through modeling pipeline.</w:t>
+      </w:r>
+    </w:p>
+    <w:p>
+      <w:pPr>
+        <w:pStyle w:val="Heading3"/>
+      </w:pPr>
+      <w:r>
+        <w:t>Univariate plot: regular_checkup_last_year</w:t>
+      </w:r>
+    </w:p>
+    <w:p>
+      <w:pPr>
+        <w:jc w:val="center"/>
+      </w:pPr>
+      <w:r>
+        <w:drawing>
+          <wp:inline xmlns:a="http://schemas.openxmlformats.org/drawingml/2006/main" xmlns:pic="http://schemas.openxmlformats.org/drawingml/2006/picture">
+            <wp:extent cx="5303520" cy="2916936"/>
+            <wp:docPr id="17" name="Picture 17"/>
+            <wp:cNvGraphicFramePr>
+              <a:graphicFrameLocks noChangeAspect="1"/>
+            </wp:cNvGraphicFramePr>
+            <a:graphic>
+              <a:graphicData uri="http://schemas.openxmlformats.org/drawingml/2006/picture">
+                <pic:pic>
+                  <pic:nvPicPr>
+                    <pic:cNvPr id="0" name="univariate_regular_checkup_last_year.png"/>
+                    <pic:cNvPicPr/>
+                  </pic:nvPicPr>
+                  <pic:blipFill>
+                    <a:blip r:embed="rId26"/>
+                    <a:stretch>
+                      <a:fillRect/>
+                    </a:stretch>
+                  </pic:blipFill>
+                  <pic:spPr>
+                    <a:xfrm>
+                      <a:off x="0" y="0"/>
+                      <a:ext cx="5303520" cy="2916936"/>
+                    </a:xfrm>
+                    <a:prstGeom prst="rect"/>
+                  </pic:spPr>
+                </pic:pic>
+              </a:graphicData>
+            </a:graphic>
+          </wp:inline>
+        </w:drawing>
+      </w:r>
+    </w:p>
+    <w:p>
+      <w:pPr>
+        <w:jc w:val="center"/>
+      </w:pPr>
+      <w:r>
+        <w:rPr>
+          <w:i/>
+          <w:color w:val="6B7280"/>
+          <w:sz w:val="17"/>
+        </w:rPr>
+        <w:t>Univariate distribution or frequency for regular_checkup_last_year.</w:t>
+      </w:r>
+    </w:p>
+    <w:p>
+      <w:r>
+        <w:rPr>
+          <w:b/>
+        </w:rPr>
+        <w:t xml:space="preserve">Technical interpretation: </w:t>
+      </w:r>
+      <w:r>
+        <w:t>`regular_checkup_last_year` has 6 non-missing levels and 0 missing values; the most frequent level is `0` at 60.9% of rows.</w:t>
+      </w:r>
+    </w:p>
+    <w:p>
+      <w:r>
+        <w:rPr>
+          <w:b/>
+        </w:rPr>
+        <w:t xml:space="preserve">Business interpretation: </w:t>
+      </w:r>
+      <w:r>
+        <w:t>The frequency view checks whether `regular_checkup_last_year` is balanced enough for EDA and downstream encoding; the preprocessing action is: normalize misspelled source name; preserve numeric/category meaning.</w:t>
+      </w:r>
+    </w:p>
+    <w:p>
+      <w:pPr>
+        <w:pStyle w:val="Heading3"/>
+      </w:pPr>
+      <w:r>
+        <w:t>Univariate plot: adventure_sports</w:t>
+      </w:r>
+    </w:p>
+    <w:p>
+      <w:pPr>
+        <w:jc w:val="center"/>
+      </w:pPr>
+      <w:r>
+        <w:drawing>
+          <wp:inline xmlns:a="http://schemas.openxmlformats.org/drawingml/2006/main" xmlns:pic="http://schemas.openxmlformats.org/drawingml/2006/picture">
+            <wp:extent cx="5303520" cy="2916936"/>
+            <wp:docPr id="18" name="Picture 18"/>
+            <wp:cNvGraphicFramePr>
+              <a:graphicFrameLocks noChangeAspect="1"/>
+            </wp:cNvGraphicFramePr>
+            <a:graphic>
+              <a:graphicData uri="http://schemas.openxmlformats.org/drawingml/2006/picture">
+                <pic:pic>
+                  <pic:nvPicPr>
+                    <pic:cNvPr id="0" name="univariate_adventure_sports.png"/>
+                    <pic:cNvPicPr/>
+                  </pic:nvPicPr>
+                  <pic:blipFill>
+                    <a:blip r:embed="rId27"/>
+                    <a:stretch>
+                      <a:fillRect/>
+                    </a:stretch>
+                  </pic:blipFill>
+                  <pic:spPr>
+                    <a:xfrm>
+                      <a:off x="0" y="0"/>
+                      <a:ext cx="5303520" cy="2916936"/>
+                    </a:xfrm>
+                    <a:prstGeom prst="rect"/>
+                  </pic:spPr>
+                </pic:pic>
+              </a:graphicData>
+            </a:graphic>
+          </wp:inline>
+        </w:drawing>
+      </w:r>
+    </w:p>
+    <w:p>
+      <w:pPr>
+        <w:jc w:val="center"/>
+      </w:pPr>
+      <w:r>
+        <w:rPr>
+          <w:i/>
+          <w:color w:val="6B7280"/>
+          <w:sz w:val="17"/>
+        </w:rPr>
+        <w:t>Univariate distribution or frequency for adventure_sports.</w:t>
+      </w:r>
+    </w:p>
+    <w:p>
+      <w:r>
+        <w:rPr>
+          <w:b/>
+        </w:rPr>
+        <w:t xml:space="preserve">Technical interpretation: </w:t>
+      </w:r>
+      <w:r>
+        <w:t>`adventure_sports` has 2 non-missing levels and 0 missing values; the most frequent level is `0` at 91.8% of rows.</w:t>
+      </w:r>
+    </w:p>
+    <w:p>
+      <w:r>
+        <w:rPr>
+          <w:b/>
+        </w:rPr>
+        <w:t xml:space="preserve">Business interpretation: </w:t>
+      </w:r>
+      <w:r>
+        <w:t>The frequency view checks whether `adventure_sports` is balanced enough for EDA and downstream encoding; the preprocessing action is: validate type, preserve for EDA, and feed through modeling pipeline.</w:t>
+      </w:r>
+    </w:p>
+    <w:p>
+      <w:pPr>
+        <w:pStyle w:val="Heading3"/>
+      </w:pPr>
+      <w:r>
+        <w:t>Univariate plot: Occupation</w:t>
+      </w:r>
+    </w:p>
+    <w:p>
+      <w:pPr>
+        <w:jc w:val="center"/>
+      </w:pPr>
+      <w:r>
+        <w:drawing>
+          <wp:inline xmlns:a="http://schemas.openxmlformats.org/drawingml/2006/main" xmlns:pic="http://schemas.openxmlformats.org/drawingml/2006/picture">
+            <wp:extent cx="5303520" cy="2918857"/>
+            <wp:docPr id="19" name="Picture 19"/>
+            <wp:cNvGraphicFramePr>
+              <a:graphicFrameLocks noChangeAspect="1"/>
+            </wp:cNvGraphicFramePr>
+            <a:graphic>
+              <a:graphicData uri="http://schemas.openxmlformats.org/drawingml/2006/picture">
+                <pic:pic>
+                  <pic:nvPicPr>
+                    <pic:cNvPr id="0" name="univariate_occupation.png"/>
+                    <pic:cNvPicPr/>
+                  </pic:nvPicPr>
+                  <pic:blipFill>
+                    <a:blip r:embed="rId28"/>
+                    <a:stretch>
+                      <a:fillRect/>
+                    </a:stretch>
+                  </pic:blipFill>
+                  <pic:spPr>
+                    <a:xfrm>
+                      <a:off x="0" y="0"/>
+                      <a:ext cx="5303520" cy="2918857"/>
+                    </a:xfrm>
+                    <a:prstGeom prst="rect"/>
+                  </pic:spPr>
+                </pic:pic>
+              </a:graphicData>
+            </a:graphic>
+          </wp:inline>
+        </w:drawing>
+      </w:r>
+    </w:p>
+    <w:p>
+      <w:pPr>
+        <w:jc w:val="center"/>
+      </w:pPr>
+      <w:r>
+        <w:rPr>
+          <w:i/>
+          <w:color w:val="6B7280"/>
+          <w:sz w:val="17"/>
+        </w:rPr>
+        <w:t>Univariate distribution or frequency for Occupation.</w:t>
+      </w:r>
+    </w:p>
+    <w:p>
+      <w:r>
+        <w:rPr>
+          <w:b/>
+        </w:rPr>
+        <w:t xml:space="preserve">Technical interpretation: </w:t>
+      </w:r>
+      <w:r>
+        <w:t>`Occupation` has 3 non-missing levels and 0 missing values; the most frequent level is `Student` at 40.7% of rows.</w:t>
+      </w:r>
+    </w:p>
+    <w:p>
+      <w:r>
+        <w:rPr>
+          <w:b/>
+        </w:rPr>
+        <w:t xml:space="preserve">Business interpretation: </w:t>
+      </w:r>
+      <w:r>
+        <w:t>The frequency view checks whether `Occupation` is balanced enough for EDA and downstream encoding; the preprocessing action is: validate type, preserve for EDA, and feed through modeling pipeline.</w:t>
+      </w:r>
+    </w:p>
+    <w:p>
+      <w:pPr>
+        <w:pStyle w:val="Heading3"/>
+      </w:pPr>
+      <w:r>
+        <w:t>Univariate plot: visited_doctor_last_1_year</w:t>
+      </w:r>
+    </w:p>
+    <w:p>
+      <w:pPr>
+        <w:jc w:val="center"/>
+      </w:pPr>
+      <w:r>
+        <w:drawing>
+          <wp:inline xmlns:a="http://schemas.openxmlformats.org/drawingml/2006/main" xmlns:pic="http://schemas.openxmlformats.org/drawingml/2006/picture">
+            <wp:extent cx="5303520" cy="2918857"/>
+            <wp:docPr id="20" name="Picture 20"/>
+            <wp:cNvGraphicFramePr>
+              <a:graphicFrameLocks noChangeAspect="1"/>
+            </wp:cNvGraphicFramePr>
+            <a:graphic>
+              <a:graphicData uri="http://schemas.openxmlformats.org/drawingml/2006/picture">
+                <pic:pic>
+                  <pic:nvPicPr>
+                    <pic:cNvPr id="0" name="univariate_visited_doctor_last_1_year.png"/>
+                    <pic:cNvPicPr/>
+                  </pic:nvPicPr>
+                  <pic:blipFill>
+                    <a:blip r:embed="rId29"/>
+                    <a:stretch>
+                      <a:fillRect/>
+                    </a:stretch>
+                  </pic:blipFill>
+                  <pic:spPr>
+                    <a:xfrm>
+                      <a:off x="0" y="0"/>
+                      <a:ext cx="5303520" cy="2918857"/>
+                    </a:xfrm>
+                    <a:prstGeom prst="rect"/>
+                  </pic:spPr>
+                </pic:pic>
+              </a:graphicData>
+            </a:graphic>
+          </wp:inline>
+        </w:drawing>
+      </w:r>
+    </w:p>
+    <w:p>
+      <w:pPr>
+        <w:jc w:val="center"/>
+      </w:pPr>
+      <w:r>
+        <w:rPr>
+          <w:i/>
+          <w:color w:val="6B7280"/>
+          <w:sz w:val="17"/>
+        </w:rPr>
+        <w:t>Univariate distribution or frequency for visited_doctor_last_1_year.</w:t>
+      </w:r>
+    </w:p>
+    <w:p>
+      <w:r>
+        <w:rPr>
+          <w:b/>
+        </w:rPr>
+        <w:t xml:space="preserve">Technical interpretation: </w:t>
+      </w:r>
+      <w:r>
+        <w:t>`visited_doctor_last_1_year` has 12 non-missing levels and 0 missing values; the most frequent level is `2` at 34.7% of rows.</w:t>
+      </w:r>
+    </w:p>
+    <w:p>
+      <w:r>
+        <w:rPr>
+          <w:b/>
+        </w:rPr>
+        <w:t xml:space="preserve">Business interpretation: </w:t>
+      </w:r>
+      <w:r>
+        <w:t>The frequency view checks whether `visited_doctor_last_1_year` is balanced enough for EDA and downstream encoding; the preprocessing action is: validate type, preserve for EDA, and feed through modeling pipeline.</w:t>
+      </w:r>
+    </w:p>
+    <w:p>
+      <w:pPr>
+        <w:pStyle w:val="Heading3"/>
+      </w:pPr>
+      <w:r>
+        <w:t>Univariate plot: cholesterol_level</w:t>
+      </w:r>
+    </w:p>
+    <w:p>
+      <w:pPr>
+        <w:jc w:val="center"/>
+      </w:pPr>
+      <w:r>
+        <w:drawing>
+          <wp:inline xmlns:a="http://schemas.openxmlformats.org/drawingml/2006/main" xmlns:pic="http://schemas.openxmlformats.org/drawingml/2006/picture">
+            <wp:extent cx="5303520" cy="2918857"/>
+            <wp:docPr id="21" name="Picture 21"/>
+            <wp:cNvGraphicFramePr>
+              <a:graphicFrameLocks noChangeAspect="1"/>
+            </wp:cNvGraphicFramePr>
+            <a:graphic>
+              <a:graphicData uri="http://schemas.openxmlformats.org/drawingml/2006/picture">
+                <pic:pic>
+                  <pic:nvPicPr>
+                    <pic:cNvPr id="0" name="univariate_cholesterol_level.png"/>
+                    <pic:cNvPicPr/>
+                  </pic:nvPicPr>
+                  <pic:blipFill>
+                    <a:blip r:embed="rId30"/>
+                    <a:stretch>
+                      <a:fillRect/>
+                    </a:stretch>
+                  </pic:blipFill>
+                  <pic:spPr>
+                    <a:xfrm>
+                      <a:off x="0" y="0"/>
+                      <a:ext cx="5303520" cy="2918857"/>
+                    </a:xfrm>
+                    <a:prstGeom prst="rect"/>
+                  </pic:spPr>
+                </pic:pic>
+              </a:graphicData>
+            </a:graphic>
+          </wp:inline>
+        </w:drawing>
+      </w:r>
+    </w:p>
+    <w:p>
+      <w:pPr>
+        <w:jc w:val="center"/>
+      </w:pPr>
+      <w:r>
+        <w:rPr>
+          <w:i/>
+          <w:color w:val="6B7280"/>
+          <w:sz w:val="17"/>
+        </w:rPr>
+        <w:t>Univariate distribution or frequency for cholesterol_level.</w:t>
+      </w:r>
+    </w:p>
+    <w:p>
+      <w:r>
+        <w:rPr>
+          <w:b/>
+        </w:rPr>
+        <w:t xml:space="preserve">Technical interpretation: </w:t>
+      </w:r>
+      <w:r>
+        <w:t>`cholesterol_level` has 5 non-missing levels and 0 missing values; the most frequent level is `150 to 175` at 35.1% of rows.</w:t>
+      </w:r>
+    </w:p>
+    <w:p>
+      <w:r>
+        <w:rPr>
+          <w:b/>
+        </w:rPr>
+        <w:t xml:space="preserve">Business interpretation: </w:t>
+      </w:r>
+      <w:r>
+        <w:t>The frequency view checks whether `cholesterol_level` is balanced enough for EDA and downstream encoding; the preprocessing action is: retain ordinal category and engineer cholesterol midpoint.</w:t>
+      </w:r>
+    </w:p>
+    <w:p>
+      <w:pPr>
+        <w:pStyle w:val="Heading3"/>
+      </w:pPr>
+      <w:r>
+        <w:t>Univariate plot: daily_avg_steps</w:t>
+      </w:r>
+    </w:p>
+    <w:p>
+      <w:pPr>
+        <w:jc w:val="center"/>
+      </w:pPr>
+      <w:r>
+        <w:drawing>
+          <wp:inline xmlns:a="http://schemas.openxmlformats.org/drawingml/2006/main" xmlns:pic="http://schemas.openxmlformats.org/drawingml/2006/picture">
+            <wp:extent cx="5303520" cy="2178873"/>
+            <wp:docPr id="22" name="Picture 22"/>
+            <wp:cNvGraphicFramePr>
+              <a:graphicFrameLocks noChangeAspect="1"/>
+            </wp:cNvGraphicFramePr>
+            <a:graphic>
+              <a:graphicData uri="http://schemas.openxmlformats.org/drawingml/2006/picture">
+                <pic:pic>
+                  <pic:nvPicPr>
+                    <pic:cNvPr id="0" name="univariate_daily_avg_steps.png"/>
+                    <pic:cNvPicPr/>
+                  </pic:nvPicPr>
+                  <pic:blipFill>
+                    <a:blip r:embed="rId31"/>
+                    <a:stretch>
+                      <a:fillRect/>
+                    </a:stretch>
+                  </pic:blipFill>
+                  <pic:spPr>
+                    <a:xfrm>
+                      <a:off x="0" y="0"/>
+                      <a:ext cx="5303520" cy="2178873"/>
+                    </a:xfrm>
+                    <a:prstGeom prst="rect"/>
+                  </pic:spPr>
+                </pic:pic>
+              </a:graphicData>
+            </a:graphic>
+          </wp:inline>
+        </w:drawing>
+      </w:r>
+    </w:p>
+    <w:p>
+      <w:pPr>
+        <w:jc w:val="center"/>
+      </w:pPr>
+      <w:r>
+        <w:rPr>
+          <w:i/>
+          <w:color w:val="6B7280"/>
+          <w:sz w:val="17"/>
+        </w:rPr>
+        <w:t>Univariate distribution or frequency for daily_avg_steps.</w:t>
+      </w:r>
+    </w:p>
+    <w:p>
+      <w:r>
+        <w:rPr>
+          <w:b/>
+        </w:rPr>
+        <w:t xml:space="preserve">Technical interpretation: </w:t>
+      </w:r>
+      <w:r>
+        <w:t>`daily_avg_steps` is numeric with 4,914 unique values, median 5,089.00, range 2,034.00 to 11,255.00, and 0 missing values.</w:t>
+      </w:r>
+    </w:p>
+    <w:p>
+      <w:r>
+        <w:rPr>
+          <w:b/>
+        </w:rPr>
+        <w:t xml:space="preserve">Business interpretation: </w:t>
+      </w:r>
+      <w:r>
+        <w:t>The distribution documents the applicant spread for `daily_avg_steps` before modeling; the preprocessing action is: validate type, preserve for EDA, and feed through modeling pipeline.</w:t>
+      </w:r>
+    </w:p>
+    <w:p>
+      <w:pPr>
+        <w:pStyle w:val="Heading3"/>
+      </w:pPr>
+      <w:r>
+        <w:t>Univariate plot: age</w:t>
+      </w:r>
+    </w:p>
+    <w:p>
+      <w:pPr>
+        <w:jc w:val="center"/>
+      </w:pPr>
+      <w:r>
+        <w:drawing>
+          <wp:inline xmlns:a="http://schemas.openxmlformats.org/drawingml/2006/main" xmlns:pic="http://schemas.openxmlformats.org/drawingml/2006/picture">
+            <wp:extent cx="5303520" cy="2183098"/>
+            <wp:docPr id="23" name="Picture 23"/>
+            <wp:cNvGraphicFramePr>
+              <a:graphicFrameLocks noChangeAspect="1"/>
+            </wp:cNvGraphicFramePr>
+            <a:graphic>
+              <a:graphicData uri="http://schemas.openxmlformats.org/drawingml/2006/picture">
+                <pic:pic>
+                  <pic:nvPicPr>
+                    <pic:cNvPr id="0" name="univariate_age.png"/>
+                    <pic:cNvPicPr/>
+                  </pic:nvPicPr>
+                  <pic:blipFill>
+                    <a:blip r:embed="rId32"/>
+                    <a:stretch>
+                      <a:fillRect/>
+                    </a:stretch>
+                  </pic:blipFill>
+                  <pic:spPr>
+                    <a:xfrm>
+                      <a:off x="0" y="0"/>
+                      <a:ext cx="5303520" cy="2183098"/>
+                    </a:xfrm>
+                    <a:prstGeom prst="rect"/>
+                  </pic:spPr>
+                </pic:pic>
+              </a:graphicData>
+            </a:graphic>
+          </wp:inline>
+        </w:drawing>
+      </w:r>
+    </w:p>
+    <w:p>
+      <w:pPr>
+        <w:jc w:val="center"/>
+      </w:pPr>
+      <w:r>
+        <w:rPr>
+          <w:i/>
+          <w:color w:val="6B7280"/>
+          <w:sz w:val="17"/>
+        </w:rPr>
+        <w:t>Univariate distribution or frequency for age.</w:t>
+      </w:r>
+    </w:p>
+    <w:p>
+      <w:r>
+        <w:rPr>
+          <w:b/>
+        </w:rPr>
+        <w:t xml:space="preserve">Technical interpretation: </w:t>
+      </w:r>
+      <w:r>
+        <w:t>`age` is numeric with 59 unique values, median 45.00, range 16.00 to 74.00, and 0 missing values.</w:t>
+      </w:r>
+    </w:p>
+    <w:p>
+      <w:r>
+        <w:rPr>
+          <w:b/>
+        </w:rPr>
+        <w:t xml:space="preserve">Business interpretation: </w:t>
+      </w:r>
+      <w:r>
+        <w:t>The distribution documents the applicant spread for `age` before modeling; the preprocessing action is: validate type, preserve for EDA, and feed through modeling pipeline.</w:t>
+      </w:r>
+    </w:p>
+    <w:p>
+      <w:pPr>
+        <w:pStyle w:val="Heading3"/>
+      </w:pPr>
+      <w:r>
+        <w:t>Univariate plot: heart_disease_history</w:t>
+      </w:r>
+    </w:p>
+    <w:p>
+      <w:pPr>
+        <w:jc w:val="center"/>
+      </w:pPr>
+      <w:r>
+        <w:drawing>
+          <wp:inline xmlns:a="http://schemas.openxmlformats.org/drawingml/2006/main" xmlns:pic="http://schemas.openxmlformats.org/drawingml/2006/picture">
+            <wp:extent cx="5303520" cy="2916936"/>
+            <wp:docPr id="24" name="Picture 24"/>
+            <wp:cNvGraphicFramePr>
+              <a:graphicFrameLocks noChangeAspect="1"/>
+            </wp:cNvGraphicFramePr>
+            <a:graphic>
+              <a:graphicData uri="http://schemas.openxmlformats.org/drawingml/2006/picture">
+                <pic:pic>
+                  <pic:nvPicPr>
+                    <pic:cNvPr id="0" name="univariate_heart_disease_history.png"/>
+                    <pic:cNvPicPr/>
+                  </pic:nvPicPr>
+                  <pic:blipFill>
+                    <a:blip r:embed="rId33"/>
+                    <a:stretch>
+                      <a:fillRect/>
+                    </a:stretch>
+                  </pic:blipFill>
+                  <pic:spPr>
+                    <a:xfrm>
+                      <a:off x="0" y="0"/>
+                      <a:ext cx="5303520" cy="2916936"/>
+                    </a:xfrm>
+                    <a:prstGeom prst="rect"/>
+                  </pic:spPr>
+                </pic:pic>
+              </a:graphicData>
+            </a:graphic>
+          </wp:inline>
+        </w:drawing>
+      </w:r>
+    </w:p>
+    <w:p>
+      <w:pPr>
+        <w:jc w:val="center"/>
+      </w:pPr>
+      <w:r>
+        <w:rPr>
+          <w:i/>
+          <w:color w:val="6B7280"/>
+          <w:sz w:val="17"/>
+        </w:rPr>
+        <w:t>Univariate distribution or frequency for heart_disease_history.</w:t>
+      </w:r>
+    </w:p>
+    <w:p>
+      <w:r>
+        <w:rPr>
+          <w:b/>
+        </w:rPr>
+        <w:t xml:space="preserve">Technical interpretation: </w:t>
+      </w:r>
+      <w:r>
+        <w:t>`heart_disease_history` has 2 non-missing levels and 0 missing values; the most frequent level is `0` at 94.5% of rows.</w:t>
+      </w:r>
+    </w:p>
+    <w:p>
+      <w:r>
+        <w:rPr>
+          <w:b/>
+        </w:rPr>
+        <w:t xml:space="preserve">Business interpretation: </w:t>
+      </w:r>
+      <w:r>
+        <w:t>The frequency view checks whether `heart_disease_history` is balanced enough for EDA and downstream encoding; the preprocessing action is: normalize misspelled source name; preserve numeric/category meaning.</w:t>
+      </w:r>
+    </w:p>
+    <w:p>
+      <w:pPr>
+        <w:pStyle w:val="Heading3"/>
+      </w:pPr>
+      <w:r>
+        <w:t>Univariate plot: other_major_disease_history</w:t>
+      </w:r>
+    </w:p>
+    <w:p>
+      <w:pPr>
+        <w:jc w:val="center"/>
+      </w:pPr>
+      <w:r>
+        <w:drawing>
+          <wp:inline xmlns:a="http://schemas.openxmlformats.org/drawingml/2006/main" xmlns:pic="http://schemas.openxmlformats.org/drawingml/2006/picture">
+            <wp:extent cx="5303520" cy="2916936"/>
+            <wp:docPr id="25" name="Picture 25"/>
+            <wp:cNvGraphicFramePr>
+              <a:graphicFrameLocks noChangeAspect="1"/>
+            </wp:cNvGraphicFramePr>
+            <a:graphic>
+              <a:graphicData uri="http://schemas.openxmlformats.org/drawingml/2006/picture">
+                <pic:pic>
+                  <pic:nvPicPr>
+                    <pic:cNvPr id="0" name="univariate_other_major_disease_history.png"/>
+                    <pic:cNvPicPr/>
+                  </pic:nvPicPr>
+                  <pic:blipFill>
+                    <a:blip r:embed="rId34"/>
+                    <a:stretch>
+                      <a:fillRect/>
+                    </a:stretch>
+                  </pic:blipFill>
+                  <pic:spPr>
+                    <a:xfrm>
+                      <a:off x="0" y="0"/>
+                      <a:ext cx="5303520" cy="2916936"/>
+                    </a:xfrm>
+                    <a:prstGeom prst="rect"/>
+                  </pic:spPr>
+                </pic:pic>
+              </a:graphicData>
+            </a:graphic>
+          </wp:inline>
+        </w:drawing>
+      </w:r>
+    </w:p>
+    <w:p>
+      <w:pPr>
+        <w:jc w:val="center"/>
+      </w:pPr>
+      <w:r>
+        <w:rPr>
+          <w:i/>
+          <w:color w:val="6B7280"/>
+          <w:sz w:val="17"/>
+        </w:rPr>
+        <w:t>Univariate distribution or frequency for other_major_disease_history.</w:t>
+      </w:r>
+    </w:p>
+    <w:p>
+      <w:r>
+        <w:rPr>
+          <w:b/>
+        </w:rPr>
+        <w:t xml:space="preserve">Technical interpretation: </w:t>
+      </w:r>
+      <w:r>
+        <w:t>`other_major_disease_history` has 2 non-missing levels and 0 missing values; the most frequent level is `0` at 90.2% of rows.</w:t>
+      </w:r>
+    </w:p>
+    <w:p>
+      <w:r>
+        <w:rPr>
+          <w:b/>
+        </w:rPr>
+        <w:t xml:space="preserve">Business interpretation: </w:t>
+      </w:r>
+      <w:r>
+        <w:t>The frequency view checks whether `other_major_disease_history` is balanced enough for EDA and downstream encoding; the preprocessing action is: normalize misspelled source name; preserve numeric/category meaning.</w:t>
+      </w:r>
+    </w:p>
+    <w:p>
+      <w:pPr>
+        <w:pStyle w:val="Heading3"/>
+      </w:pPr>
+      <w:r>
+        <w:t>Univariate plot: Gender</w:t>
+      </w:r>
+    </w:p>
+    <w:p>
+      <w:pPr>
+        <w:jc w:val="center"/>
+      </w:pPr>
+      <w:r>
+        <w:drawing>
+          <wp:inline xmlns:a="http://schemas.openxmlformats.org/drawingml/2006/main" xmlns:pic="http://schemas.openxmlformats.org/drawingml/2006/picture">
+            <wp:extent cx="5303520" cy="2922348"/>
+            <wp:docPr id="26" name="Picture 26"/>
+            <wp:cNvGraphicFramePr>
+              <a:graphicFrameLocks noChangeAspect="1"/>
+            </wp:cNvGraphicFramePr>
+            <a:graphic>
+              <a:graphicData uri="http://schemas.openxmlformats.org/drawingml/2006/picture">
+                <pic:pic>
+                  <pic:nvPicPr>
+                    <pic:cNvPr id="0" name="univariate_gender.png"/>
+                    <pic:cNvPicPr/>
+                  </pic:nvPicPr>
+                  <pic:blipFill>
+                    <a:blip r:embed="rId35"/>
+                    <a:stretch>
+                      <a:fillRect/>
+                    </a:stretch>
+                  </pic:blipFill>
+                  <pic:spPr>
+                    <a:xfrm>
+                      <a:off x="0" y="0"/>
+                      <a:ext cx="5303520" cy="2922348"/>
+                    </a:xfrm>
+                    <a:prstGeom prst="rect"/>
+                  </pic:spPr>
+                </pic:pic>
+              </a:graphicData>
+            </a:graphic>
+          </wp:inline>
+        </w:drawing>
+      </w:r>
+    </w:p>
+    <w:p>
+      <w:pPr>
+        <w:jc w:val="center"/>
+      </w:pPr>
+      <w:r>
+        <w:rPr>
+          <w:i/>
+          <w:color w:val="6B7280"/>
+          <w:sz w:val="17"/>
+        </w:rPr>
+        <w:t>Univariate distribution or frequency for Gender.</w:t>
+      </w:r>
+    </w:p>
+    <w:p>
+      <w:r>
+        <w:rPr>
+          <w:b/>
+        </w:rPr>
+        <w:t xml:space="preserve">Technical interpretation: </w:t>
+      </w:r>
+      <w:r>
+        <w:t>`Gender` has 2 non-missing levels and 0 missing values; the most frequent level is `Male` at 65.7% of rows.</w:t>
+      </w:r>
+    </w:p>
+    <w:p>
+      <w:r>
+        <w:rPr>
+          <w:b/>
+        </w:rPr>
+        <w:t xml:space="preserve">Business interpretation: </w:t>
+      </w:r>
+      <w:r>
+        <w:t>The frequency view checks whether `Gender` is balanced enough for EDA and downstream encoding; the preprocessing action is: validate type, preserve for EDA, and feed through modeling pipeline.</w:t>
+      </w:r>
+    </w:p>
+    <w:p>
+      <w:pPr>
+        <w:pStyle w:val="Heading3"/>
+      </w:pPr>
+      <w:r>
+        <w:t>Univariate plot: avg_glucose_level</w:t>
+      </w:r>
+    </w:p>
+    <w:p>
+      <w:pPr>
+        <w:jc w:val="center"/>
+      </w:pPr>
+      <w:r>
+        <w:drawing>
+          <wp:inline xmlns:a="http://schemas.openxmlformats.org/drawingml/2006/main" xmlns:pic="http://schemas.openxmlformats.org/drawingml/2006/picture">
+            <wp:extent cx="5303520" cy="2178873"/>
+            <wp:docPr id="27" name="Picture 27"/>
+            <wp:cNvGraphicFramePr>
+              <a:graphicFrameLocks noChangeAspect="1"/>
+            </wp:cNvGraphicFramePr>
+            <a:graphic>
+              <a:graphicData uri="http://schemas.openxmlformats.org/drawingml/2006/picture">
+                <pic:pic>
+                  <pic:nvPicPr>
+                    <pic:cNvPr id="0" name="univariate_avg_glucose_level.png"/>
+                    <pic:cNvPicPr/>
+                  </pic:nvPicPr>
+                  <pic:blipFill>
+                    <a:blip r:embed="rId36"/>
+                    <a:stretch>
+                      <a:fillRect/>
+                    </a:stretch>
+                  </pic:blipFill>
+                  <pic:spPr>
+                    <a:xfrm>
+                      <a:off x="0" y="0"/>
+                      <a:ext cx="5303520" cy="2178873"/>
+                    </a:xfrm>
+                    <a:prstGeom prst="rect"/>
+                  </pic:spPr>
+                </pic:pic>
+              </a:graphicData>
+            </a:graphic>
+          </wp:inline>
+        </w:drawing>
+      </w:r>
+    </w:p>
+    <w:p>
+      <w:pPr>
+        <w:jc w:val="center"/>
+      </w:pPr>
+      <w:r>
+        <w:rPr>
+          <w:i/>
+          <w:color w:val="6B7280"/>
+          <w:sz w:val="17"/>
+        </w:rPr>
+        <w:t>Univariate distribution or frequency for avg_glucose_level.</w:t>
+      </w:r>
+    </w:p>
+    <w:p>
+      <w:r>
+        <w:rPr>
+          <w:b/>
+        </w:rPr>
+        <w:t xml:space="preserve">Technical interpretation: </w:t>
+      </w:r>
+      <w:r>
+        <w:t>`avg_glucose_level` is numeric with 221 unique values, median 168.00, range 57.00 to 277.00, and 0 missing values.</w:t>
+      </w:r>
+    </w:p>
+    <w:p>
+      <w:r>
+        <w:rPr>
+          <w:b/>
+        </w:rPr>
+        <w:t xml:space="preserve">Business interpretation: </w:t>
+      </w:r>
+      <w:r>
+        <w:t>The distribution documents the applicant spread for `avg_glucose_level` before modeling; the preprocessing action is: validate type, preserve for EDA, and feed through modeling pipeline.</w:t>
+      </w:r>
+    </w:p>
+    <w:p>
+      <w:pPr>
+        <w:pStyle w:val="Heading3"/>
+      </w:pPr>
+      <w:r>
+        <w:t>Univariate plot: bmi</w:t>
+      </w:r>
+    </w:p>
+    <w:p>
+      <w:pPr>
+        <w:jc w:val="center"/>
+      </w:pPr>
+      <w:r>
+        <w:drawing>
+          <wp:inline xmlns:a="http://schemas.openxmlformats.org/drawingml/2006/main" xmlns:pic="http://schemas.openxmlformats.org/drawingml/2006/picture">
+            <wp:extent cx="5303520" cy="2181866"/>
+            <wp:docPr id="28" name="Picture 28"/>
+            <wp:cNvGraphicFramePr>
+              <a:graphicFrameLocks noChangeAspect="1"/>
+            </wp:cNvGraphicFramePr>
+            <a:graphic>
+              <a:graphicData uri="http://schemas.openxmlformats.org/drawingml/2006/picture">
+                <pic:pic>
+                  <pic:nvPicPr>
+                    <pic:cNvPr id="0" name="univariate_bmi.png"/>
+                    <pic:cNvPicPr/>
+                  </pic:nvPicPr>
+                  <pic:blipFill>
+                    <a:blip r:embed="rId37"/>
+                    <a:stretch>
+                      <a:fillRect/>
+                    </a:stretch>
+                  </pic:blipFill>
+                  <pic:spPr>
+                    <a:xfrm>
+                      <a:off x="0" y="0"/>
+                      <a:ext cx="5303520" cy="2181866"/>
+                    </a:xfrm>
+                    <a:prstGeom prst="rect"/>
+                  </pic:spPr>
+                </pic:pic>
+              </a:graphicData>
+            </a:graphic>
+          </wp:inline>
+        </w:drawing>
+      </w:r>
+    </w:p>
+    <w:p>
+      <w:pPr>
+        <w:jc w:val="center"/>
+      </w:pPr>
+      <w:r>
+        <w:rPr>
+          <w:i/>
+          <w:color w:val="6B7280"/>
+          <w:sz w:val="17"/>
+        </w:rPr>
+        <w:t>Univariate distribution or frequency for bmi.</w:t>
+      </w:r>
+    </w:p>
+    <w:p>
+      <w:r>
+        <w:rPr>
+          <w:b/>
+        </w:rPr>
+        <w:t xml:space="preserve">Technical interpretation: </w:t>
+      </w:r>
+      <w:r>
+        <w:t>`bmi` is numeric with 465 unique values, median 30.50, range 12.30 to 100.60, and 990 missing values.</w:t>
+      </w:r>
+    </w:p>
+    <w:p>
+      <w:r>
+        <w:rPr>
+          <w:b/>
+        </w:rPr>
+        <w:t xml:space="preserve">Business interpretation: </w:t>
+      </w:r>
+      <w:r>
+        <w:t>The distribution documents the applicant spread for `bmi` before modeling; the preprocessing action is: create missingness flag; impute using train-fitted median logic.</w:t>
+      </w:r>
+    </w:p>
+    <w:p>
+      <w:pPr>
+        <w:pStyle w:val="Heading3"/>
+      </w:pPr>
+      <w:r>
+        <w:t>Univariate plot: smoking_status</w:t>
+      </w:r>
+    </w:p>
+    <w:p>
+      <w:pPr>
+        <w:jc w:val="center"/>
+      </w:pPr>
+      <w:r>
+        <w:drawing>
+          <wp:inline xmlns:a="http://schemas.openxmlformats.org/drawingml/2006/main" xmlns:pic="http://schemas.openxmlformats.org/drawingml/2006/picture">
+            <wp:extent cx="5303520" cy="2918857"/>
+            <wp:docPr id="29" name="Picture 29"/>
+            <wp:cNvGraphicFramePr>
+              <a:graphicFrameLocks noChangeAspect="1"/>
+            </wp:cNvGraphicFramePr>
+            <a:graphic>
+              <a:graphicData uri="http://schemas.openxmlformats.org/drawingml/2006/picture">
+                <pic:pic>
+                  <pic:nvPicPr>
+                    <pic:cNvPr id="0" name="univariate_smoking_status.png"/>
+                    <pic:cNvPicPr/>
+                  </pic:nvPicPr>
+                  <pic:blipFill>
+                    <a:blip r:embed="rId38"/>
+                    <a:stretch>
+                      <a:fillRect/>
+                    </a:stretch>
+                  </pic:blipFill>
+                  <pic:spPr>
+                    <a:xfrm>
+                      <a:off x="0" y="0"/>
+                      <a:ext cx="5303520" cy="2918857"/>
+                    </a:xfrm>
+                    <a:prstGeom prst="rect"/>
+                  </pic:spPr>
+                </pic:pic>
+              </a:graphicData>
+            </a:graphic>
+          </wp:inline>
+        </w:drawing>
+      </w:r>
+    </w:p>
+    <w:p>
+      <w:pPr>
+        <w:jc w:val="center"/>
+      </w:pPr>
+      <w:r>
+        <w:rPr>
+          <w:i/>
+          <w:color w:val="6B7280"/>
+          <w:sz w:val="17"/>
+        </w:rPr>
+        <w:t>Univariate distribution or frequency for smoking_status.</w:t>
+      </w:r>
+    </w:p>
+    <w:p>
+      <w:r>
+        <w:rPr>
+          <w:b/>
+        </w:rPr>
+        <w:t xml:space="preserve">Technical interpretation: </w:t>
+      </w:r>
+      <w:r>
+        <w:t>`smoking_status` has 4 non-missing levels and 0 missing values; the most frequent level is `never smoked` at 37.0% of rows.</w:t>
+      </w:r>
+    </w:p>
+    <w:p>
+      <w:r>
+        <w:rPr>
+          <w:b/>
+        </w:rPr>
+        <w:t xml:space="preserve">Business interpretation: </w:t>
+      </w:r>
+      <w:r>
+        <w:t>The frequency view checks whether `smoking_status` is balanced enough for EDA and downstream encoding; the preprocessing action is: validate type, preserve for EDA, and feed through modeling pipeline.</w:t>
+      </w:r>
+    </w:p>
+    <w:p>
+      <w:pPr>
+        <w:pStyle w:val="Heading3"/>
+      </w:pPr>
+      <w:r>
+        <w:t>Univariate plot: Year_last_admitted</w:t>
+      </w:r>
+    </w:p>
+    <w:p>
+      <w:pPr>
+        <w:jc w:val="center"/>
+      </w:pPr>
+      <w:r>
+        <w:drawing>
+          <wp:inline xmlns:a="http://schemas.openxmlformats.org/drawingml/2006/main" xmlns:pic="http://schemas.openxmlformats.org/drawingml/2006/picture">
+            <wp:extent cx="5303520" cy="2918857"/>
+            <wp:docPr id="30" name="Picture 30"/>
+            <wp:cNvGraphicFramePr>
+              <a:graphicFrameLocks noChangeAspect="1"/>
+            </wp:cNvGraphicFramePr>
+            <a:graphic>
+              <a:graphicData uri="http://schemas.openxmlformats.org/drawingml/2006/picture">
+                <pic:pic>
+                  <pic:nvPicPr>
+                    <pic:cNvPr id="0" name="univariate_year_last_admitted.png"/>
+                    <pic:cNvPicPr/>
+                  </pic:nvPicPr>
+                  <pic:blipFill>
+                    <a:blip r:embed="rId39"/>
+                    <a:stretch>
+                      <a:fillRect/>
+                    </a:stretch>
+                  </pic:blipFill>
+                  <pic:spPr>
+                    <a:xfrm>
+                      <a:off x="0" y="0"/>
+                      <a:ext cx="5303520" cy="2918857"/>
+                    </a:xfrm>
+                    <a:prstGeom prst="rect"/>
+                  </pic:spPr>
+                </pic:pic>
+              </a:graphicData>
+            </a:graphic>
+          </wp:inline>
+        </w:drawing>
+      </w:r>
+    </w:p>
+    <w:p>
+      <w:pPr>
+        <w:jc w:val="center"/>
+      </w:pPr>
+      <w:r>
+        <w:rPr>
+          <w:i/>
+          <w:color w:val="6B7280"/>
+          <w:sz w:val="17"/>
+        </w:rPr>
+        <w:t>Univariate distribution or frequency for Year_last_admitted.</w:t>
+      </w:r>
+    </w:p>
+    <w:p>
+      <w:r>
+        <w:rPr>
+          <w:b/>
+        </w:rPr>
+        <w:t xml:space="preserve">Technical interpretation: </w:t>
+      </w:r>
+      <w:r>
+        <w:t>`Year_last_admitted` has 29 non-missing levels and 11,881 missing values; the most frequent level is `Missing/no known admission` at 47.5% of rows.</w:t>
+      </w:r>
+    </w:p>
+    <w:p>
+      <w:r>
+        <w:rPr>
+          <w:b/>
+        </w:rPr>
+        <w:t xml:space="preserve">Business interpretation: </w:t>
+      </w:r>
+      <w:r>
+        <w:t>The frequency view checks whether `Year_last_admitted` is balanced enough for EDA and downstream encoding; the preprocessing action is: create admission flags/status and recency; keep missingness signal.</w:t>
+      </w:r>
+    </w:p>
+    <w:p>
+      <w:pPr>
+        <w:pStyle w:val="Heading3"/>
+      </w:pPr>
+      <w:r>
+        <w:t>Univariate plot: Location</w:t>
+      </w:r>
+    </w:p>
+    <w:p>
+      <w:pPr>
+        <w:jc w:val="center"/>
+      </w:pPr>
+      <w:r>
+        <w:drawing>
+          <wp:inline xmlns:a="http://schemas.openxmlformats.org/drawingml/2006/main" xmlns:pic="http://schemas.openxmlformats.org/drawingml/2006/picture">
+            <wp:extent cx="5303520" cy="2916936"/>
+            <wp:docPr id="31" name="Picture 31"/>
+            <wp:cNvGraphicFramePr>
+              <a:graphicFrameLocks noChangeAspect="1"/>
+            </wp:cNvGraphicFramePr>
+            <a:graphic>
+              <a:graphicData uri="http://schemas.openxmlformats.org/drawingml/2006/picture">
+                <pic:pic>
+                  <pic:nvPicPr>
+                    <pic:cNvPr id="0" name="univariate_location.png"/>
+                    <pic:cNvPicPr/>
+                  </pic:nvPicPr>
+                  <pic:blipFill>
+                    <a:blip r:embed="rId40"/>
+                    <a:stretch>
+                      <a:fillRect/>
+                    </a:stretch>
+                  </pic:blipFill>
+                  <pic:spPr>
+                    <a:xfrm>
+                      <a:off x="0" y="0"/>
+                      <a:ext cx="5303520" cy="2916936"/>
+                    </a:xfrm>
+                    <a:prstGeom prst="rect"/>
+                  </pic:spPr>
+                </pic:pic>
+              </a:graphicData>
+            </a:graphic>
+          </wp:inline>
+        </w:drawing>
+      </w:r>
+    </w:p>
+    <w:p>
+      <w:pPr>
+        <w:jc w:val="center"/>
+      </w:pPr>
+      <w:r>
+        <w:rPr>
+          <w:i/>
+          <w:color w:val="6B7280"/>
+          <w:sz w:val="17"/>
+        </w:rPr>
+        <w:t>Univariate distribution or frequency for Location.</w:t>
+      </w:r>
+    </w:p>
+    <w:p>
+      <w:r>
+        <w:rPr>
+          <w:b/>
+        </w:rPr>
+        <w:t xml:space="preserve">Technical interpretation: </w:t>
+      </w:r>
+      <w:r>
+        <w:t>`Location` has 15 non-missing levels and 0 missing values; the most frequent level is `Bangalore` at 7.0% of rows.</w:t>
+      </w:r>
+    </w:p>
+    <w:p>
+      <w:r>
+        <w:rPr>
+          <w:b/>
+        </w:rPr>
+        <w:t xml:space="preserve">Business interpretation: </w:t>
+      </w:r>
+      <w:r>
+        <w:t>The frequency view checks whether `Location` is balanced enough for EDA and downstream encoding; the preprocessing action is: validate type, preserve for EDA, and feed through modeling pipeline.</w:t>
+      </w:r>
+    </w:p>
+    <w:p>
+      <w:pPr>
+        <w:pStyle w:val="Heading3"/>
+      </w:pPr>
+      <w:r>
+        <w:t>Univariate plot: weight</w:t>
+      </w:r>
+    </w:p>
+    <w:p>
+      <w:pPr>
+        <w:jc w:val="center"/>
+      </w:pPr>
+      <w:r>
+        <w:drawing>
+          <wp:inline xmlns:a="http://schemas.openxmlformats.org/drawingml/2006/main" xmlns:pic="http://schemas.openxmlformats.org/drawingml/2006/picture">
+            <wp:extent cx="5303520" cy="2181866"/>
+            <wp:docPr id="32" name="Picture 32"/>
+            <wp:cNvGraphicFramePr>
+              <a:graphicFrameLocks noChangeAspect="1"/>
+            </wp:cNvGraphicFramePr>
+            <a:graphic>
+              <a:graphicData uri="http://schemas.openxmlformats.org/drawingml/2006/picture">
+                <pic:pic>
+                  <pic:nvPicPr>
+                    <pic:cNvPr id="0" name="univariate_weight.png"/>
+                    <pic:cNvPicPr/>
+                  </pic:nvPicPr>
+                  <pic:blipFill>
+                    <a:blip r:embed="rId41"/>
+                    <a:stretch>
+                      <a:fillRect/>
+                    </a:stretch>
+                  </pic:blipFill>
+                  <pic:spPr>
+                    <a:xfrm>
+                      <a:off x="0" y="0"/>
+                      <a:ext cx="5303520" cy="2181866"/>
+                    </a:xfrm>
+                    <a:prstGeom prst="rect"/>
+                  </pic:spPr>
+                </pic:pic>
+              </a:graphicData>
+            </a:graphic>
+          </wp:inline>
+        </w:drawing>
+      </w:r>
+    </w:p>
+    <w:p>
+      <w:pPr>
+        <w:jc w:val="center"/>
+      </w:pPr>
+      <w:r>
+        <w:rPr>
+          <w:i/>
+          <w:color w:val="6B7280"/>
+          <w:sz w:val="17"/>
+        </w:rPr>
+        <w:t>Univariate distribution or frequency for weight.</w:t>
+      </w:r>
+    </w:p>
+    <w:p>
+      <w:r>
+        <w:rPr>
+          <w:b/>
+        </w:rPr>
+        <w:t xml:space="preserve">Technical interpretation: </w:t>
+      </w:r>
+      <w:r>
+        <w:t>`weight` is numeric with 45 unique values, median 72.00, range 52.00 to 96.00, and 0 missing values.</w:t>
+      </w:r>
+    </w:p>
+    <w:p>
+      <w:r>
+        <w:rPr>
+          <w:b/>
+        </w:rPr>
+        <w:t xml:space="preserve">Business interpretation: </w:t>
+      </w:r>
+      <w:r>
+        <w:t>The distribution documents the applicant spread for `weight` before modeling; the preprocessing action is: validate type, preserve for EDA, and feed through modeling pipeline.</w:t>
+      </w:r>
+    </w:p>
+    <w:p>
+      <w:pPr>
+        <w:pStyle w:val="Heading3"/>
+      </w:pPr>
+      <w:r>
+        <w:t>Univariate plot: covered_by_any_other_company</w:t>
+      </w:r>
+    </w:p>
+    <w:p>
+      <w:pPr>
+        <w:jc w:val="center"/>
+      </w:pPr>
+      <w:r>
+        <w:drawing>
+          <wp:inline xmlns:a="http://schemas.openxmlformats.org/drawingml/2006/main" xmlns:pic="http://schemas.openxmlformats.org/drawingml/2006/picture">
+            <wp:extent cx="5303520" cy="2918857"/>
+            <wp:docPr id="33" name="Picture 33"/>
+            <wp:cNvGraphicFramePr>
+              <a:graphicFrameLocks noChangeAspect="1"/>
+            </wp:cNvGraphicFramePr>
+            <a:graphic>
+              <a:graphicData uri="http://schemas.openxmlformats.org/drawingml/2006/picture">
+                <pic:pic>
+                  <pic:nvPicPr>
+                    <pic:cNvPr id="0" name="univariate_covered_by_any_other_company.png"/>
+                    <pic:cNvPicPr/>
+                  </pic:nvPicPr>
+                  <pic:blipFill>
+                    <a:blip r:embed="rId42"/>
+                    <a:stretch>
+                      <a:fillRect/>
+                    </a:stretch>
+                  </pic:blipFill>
+                  <pic:spPr>
+                    <a:xfrm>
+                      <a:off x="0" y="0"/>
+                      <a:ext cx="5303520" cy="2918857"/>
+                    </a:xfrm>
+                    <a:prstGeom prst="rect"/>
+                  </pic:spPr>
+                </pic:pic>
+              </a:graphicData>
+            </a:graphic>
+          </wp:inline>
+        </w:drawing>
+      </w:r>
+    </w:p>
+    <w:p>
+      <w:pPr>
+        <w:jc w:val="center"/>
+      </w:pPr>
+      <w:r>
+        <w:rPr>
+          <w:i/>
+          <w:color w:val="6B7280"/>
+          <w:sz w:val="17"/>
+        </w:rPr>
+        <w:t>Univariate distribution or frequency for covered_by_any_other_company.</w:t>
+      </w:r>
+    </w:p>
+    <w:p>
+      <w:r>
+        <w:rPr>
+          <w:b/>
+        </w:rPr>
+        <w:t xml:space="preserve">Technical interpretation: </w:t>
+      </w:r>
+      <w:r>
+        <w:t>`covered_by_any_other_company` has 2 non-missing levels and 0 missing values; the most frequent level is `N` at 69.7% of rows.</w:t>
+      </w:r>
+    </w:p>
+    <w:p>
+      <w:r>
+        <w:rPr>
+          <w:b/>
+        </w:rPr>
+        <w:t xml:space="preserve">Business interpretation: </w:t>
+      </w:r>
+      <w:r>
+        <w:t>The frequency view checks whether `covered_by_any_other_company` is balanced enough for EDA and downstream encoding; the preprocessing action is: validate type, preserve for EDA, and feed through modeling pipeline.</w:t>
+      </w:r>
+    </w:p>
+    <w:p>
+      <w:pPr>
+        <w:pStyle w:val="Heading3"/>
+      </w:pPr>
+      <w:r>
+        <w:t>Univariate plot: Alcohol</w:t>
+      </w:r>
+    </w:p>
+    <w:p>
+      <w:pPr>
+        <w:jc w:val="center"/>
+      </w:pPr>
+      <w:r>
+        <w:drawing>
+          <wp:inline xmlns:a="http://schemas.openxmlformats.org/drawingml/2006/main" xmlns:pic="http://schemas.openxmlformats.org/drawingml/2006/picture">
+            <wp:extent cx="5303520" cy="2920425"/>
+            <wp:docPr id="34" name="Picture 34"/>
+            <wp:cNvGraphicFramePr>
+              <a:graphicFrameLocks noChangeAspect="1"/>
+            </wp:cNvGraphicFramePr>
+            <a:graphic>
+              <a:graphicData uri="http://schemas.openxmlformats.org/drawingml/2006/picture">
+                <pic:pic>
+                  <pic:nvPicPr>
+                    <pic:cNvPr id="0" name="univariate_alcohol.png"/>
+                    <pic:cNvPicPr/>
+                  </pic:nvPicPr>
+                  <pic:blipFill>
+                    <a:blip r:embed="rId43"/>
+                    <a:stretch>
+                      <a:fillRect/>
+                    </a:stretch>
+                  </pic:blipFill>
+                  <pic:spPr>
+                    <a:xfrm>
+                      <a:off x="0" y="0"/>
+                      <a:ext cx="5303520" cy="2920425"/>
+                    </a:xfrm>
+                    <a:prstGeom prst="rect"/>
+                  </pic:spPr>
+                </pic:pic>
+              </a:graphicData>
+            </a:graphic>
+          </wp:inline>
+        </w:drawing>
+      </w:r>
+    </w:p>
+    <w:p>
+      <w:pPr>
+        <w:jc w:val="center"/>
+      </w:pPr>
+      <w:r>
+        <w:rPr>
+          <w:i/>
+          <w:color w:val="6B7280"/>
+          <w:sz w:val="17"/>
+        </w:rPr>
+        <w:t>Univariate distribution or frequency for Alcohol.</w:t>
+      </w:r>
+    </w:p>
+    <w:p>
+      <w:r>
+        <w:rPr>
+          <w:b/>
+        </w:rPr>
+        <w:t xml:space="preserve">Technical interpretation: </w:t>
+      </w:r>
+      <w:r>
+        <w:t>`Alcohol` has 3 non-missing levels and 0 missing values; the most frequent level is `Rare` at 55.0% of rows.</w:t>
+      </w:r>
+    </w:p>
+    <w:p>
+      <w:r>
+        <w:rPr>
+          <w:b/>
+        </w:rPr>
+        <w:t xml:space="preserve">Business interpretation: </w:t>
+      </w:r>
+      <w:r>
+        <w:t>The frequency view checks whether `Alcohol` is balanced enough for EDA and downstream encoding; the preprocessing action is: validate type, preserve for EDA, and feed through modeling pipeline.</w:t>
+      </w:r>
+    </w:p>
+    <w:p>
+      <w:pPr>
+        <w:pStyle w:val="Heading3"/>
+      </w:pPr>
+      <w:r>
+        <w:t>Univariate plot: exercise</w:t>
+      </w:r>
+    </w:p>
+    <w:p>
+      <w:pPr>
+        <w:jc w:val="center"/>
+      </w:pPr>
+      <w:r>
+        <w:drawing>
+          <wp:inline xmlns:a="http://schemas.openxmlformats.org/drawingml/2006/main" xmlns:pic="http://schemas.openxmlformats.org/drawingml/2006/picture">
+            <wp:extent cx="5303520" cy="2920425"/>
+            <wp:docPr id="35" name="Picture 35"/>
+            <wp:cNvGraphicFramePr>
+              <a:graphicFrameLocks noChangeAspect="1"/>
+            </wp:cNvGraphicFramePr>
+            <a:graphic>
+              <a:graphicData uri="http://schemas.openxmlformats.org/drawingml/2006/picture">
+                <pic:pic>
+                  <pic:nvPicPr>
+                    <pic:cNvPr id="0" name="univariate_exercise.png"/>
+                    <pic:cNvPicPr/>
+                  </pic:nvPicPr>
+                  <pic:blipFill>
+                    <a:blip r:embed="rId44"/>
+                    <a:stretch>
+                      <a:fillRect/>
+                    </a:stretch>
+                  </pic:blipFill>
+                  <pic:spPr>
+                    <a:xfrm>
+                      <a:off x="0" y="0"/>
+                      <a:ext cx="5303520" cy="2920425"/>
+                    </a:xfrm>
+                    <a:prstGeom prst="rect"/>
+                  </pic:spPr>
+                </pic:pic>
+              </a:graphicData>
+            </a:graphic>
+          </wp:inline>
+        </w:drawing>
+      </w:r>
+    </w:p>
+    <w:p>
+      <w:pPr>
+        <w:jc w:val="center"/>
+      </w:pPr>
+      <w:r>
+        <w:rPr>
+          <w:i/>
+          <w:color w:val="6B7280"/>
+          <w:sz w:val="17"/>
+        </w:rPr>
+        <w:t>Univariate distribution or frequency for exercise.</w:t>
+      </w:r>
+    </w:p>
+    <w:p>
+      <w:r>
+        <w:rPr>
+          <w:b/>
+        </w:rPr>
+        <w:t xml:space="preserve">Technical interpretation: </w:t>
+      </w:r>
+      <w:r>
+        <w:t>`exercise` has 3 non-missing levels and 0 missing values; the most frequent level is `Moderate` at 58.6% of rows.</w:t>
+      </w:r>
+    </w:p>
+    <w:p>
+      <w:r>
+        <w:rPr>
+          <w:b/>
+        </w:rPr>
+        <w:t xml:space="preserve">Business interpretation: </w:t>
+      </w:r>
+      <w:r>
+        <w:t>The frequency view checks whether `exercise` is balanced enough for EDA and downstream encoding; the preprocessing action is: validate type, preserve for EDA, and feed through modeling pipeline.</w:t>
+      </w:r>
+    </w:p>
+    <w:p>
+      <w:pPr>
+        <w:pStyle w:val="Heading3"/>
+      </w:pPr>
+      <w:r>
+        <w:t>Univariate plot: weight_change_in_last_one_year</w:t>
+      </w:r>
+    </w:p>
+    <w:p>
+      <w:pPr>
+        <w:jc w:val="center"/>
+      </w:pPr>
+      <w:r>
+        <w:drawing>
+          <wp:inline xmlns:a="http://schemas.openxmlformats.org/drawingml/2006/main" xmlns:pic="http://schemas.openxmlformats.org/drawingml/2006/picture">
+            <wp:extent cx="5303520" cy="2916936"/>
+            <wp:docPr id="36" name="Picture 36"/>
+            <wp:cNvGraphicFramePr>
+              <a:graphicFrameLocks noChangeAspect="1"/>
+            </wp:cNvGraphicFramePr>
+            <a:graphic>
+              <a:graphicData uri="http://schemas.openxmlformats.org/drawingml/2006/picture">
+                <pic:pic>
+                  <pic:nvPicPr>
+                    <pic:cNvPr id="0" name="univariate_weight_change_in_last_one_year.png"/>
+                    <pic:cNvPicPr/>
+                  </pic:nvPicPr>
+                  <pic:blipFill>
+                    <a:blip r:embed="rId45"/>
+                    <a:stretch>
+                      <a:fillRect/>
+                    </a:stretch>
+                  </pic:blipFill>
+                  <pic:spPr>
+                    <a:xfrm>
+                      <a:off x="0" y="0"/>
+                      <a:ext cx="5303520" cy="2916936"/>
+                    </a:xfrm>
+                    <a:prstGeom prst="rect"/>
+                  </pic:spPr>
+                </pic:pic>
+              </a:graphicData>
+            </a:graphic>
+          </wp:inline>
+        </w:drawing>
+      </w:r>
+    </w:p>
+    <w:p>
+      <w:pPr>
+        <w:jc w:val="center"/>
+      </w:pPr>
+      <w:r>
+        <w:rPr>
+          <w:i/>
+          <w:color w:val="6B7280"/>
+          <w:sz w:val="17"/>
+        </w:rPr>
+        <w:t>Univariate distribution or frequency for weight_change_in_last_one_year.</w:t>
+      </w:r>
+    </w:p>
+    <w:p>
+      <w:r>
+        <w:rPr>
+          <w:b/>
+        </w:rPr>
+        <w:t xml:space="preserve">Technical interpretation: </w:t>
+      </w:r>
+      <w:r>
+        <w:t>`weight_change_in_last_one_year` has 7 non-missing levels and 0 missing values; the most frequent level is `4` at 20.3% of rows.</w:t>
+      </w:r>
+    </w:p>
+    <w:p>
+      <w:r>
+        <w:rPr>
+          <w:b/>
+        </w:rPr>
+        <w:t xml:space="preserve">Business interpretation: </w:t>
+      </w:r>
+      <w:r>
+        <w:t>The frequency view checks whether `weight_change_in_last_one_year` is balanced enough for EDA and downstream encoding; the preprocessing action is: validate type, preserve for EDA, and feed through modeling pipeline.</w:t>
+      </w:r>
+    </w:p>
+    <w:p>
+      <w:pPr>
+        <w:pStyle w:val="Heading3"/>
+      </w:pPr>
+      <w:r>
+        <w:t>Univariate plot: fat_percentage</w:t>
+      </w:r>
+    </w:p>
+    <w:p>
+      <w:pPr>
+        <w:jc w:val="center"/>
+      </w:pPr>
+      <w:r>
+        <w:drawing>
+          <wp:inline xmlns:a="http://schemas.openxmlformats.org/drawingml/2006/main" xmlns:pic="http://schemas.openxmlformats.org/drawingml/2006/picture">
+            <wp:extent cx="5303520" cy="2178873"/>
+            <wp:docPr id="37" name="Picture 37"/>
+            <wp:cNvGraphicFramePr>
+              <a:graphicFrameLocks noChangeAspect="1"/>
+            </wp:cNvGraphicFramePr>
+            <a:graphic>
+              <a:graphicData uri="http://schemas.openxmlformats.org/drawingml/2006/picture">
+                <pic:pic>
+                  <pic:nvPicPr>
+                    <pic:cNvPr id="0" name="univariate_fat_percentage.png"/>
+                    <pic:cNvPicPr/>
+                  </pic:nvPicPr>
+                  <pic:blipFill>
+                    <a:blip r:embed="rId46"/>
+                    <a:stretch>
+                      <a:fillRect/>
+                    </a:stretch>
+                  </pic:blipFill>
+                  <pic:spPr>
+                    <a:xfrm>
+                      <a:off x="0" y="0"/>
+                      <a:ext cx="5303520" cy="2178873"/>
+                    </a:xfrm>
+                    <a:prstGeom prst="rect"/>
+                  </pic:spPr>
+                </pic:pic>
+              </a:graphicData>
+            </a:graphic>
+          </wp:inline>
+        </w:drawing>
+      </w:r>
+    </w:p>
+    <w:p>
+      <w:pPr>
+        <w:jc w:val="center"/>
+      </w:pPr>
+      <w:r>
+        <w:rPr>
+          <w:i/>
+          <w:color w:val="6B7280"/>
+          <w:sz w:val="17"/>
+        </w:rPr>
+        <w:t>Univariate distribution or frequency for fat_percentage.</w:t>
+      </w:r>
+    </w:p>
+    <w:p>
+      <w:r>
+        <w:rPr>
+          <w:b/>
+        </w:rPr>
+        <w:t xml:space="preserve">Technical interpretation: </w:t>
+      </w:r>
+      <w:r>
+        <w:t>`fat_percentage` is numeric with 32 unique values, median 31.00, range 11.00 to 42.00, and 0 missing values.</w:t>
+      </w:r>
+    </w:p>
+    <w:p>
+      <w:r>
+        <w:rPr>
+          <w:b/>
+        </w:rPr>
+        <w:t xml:space="preserve">Business interpretation: </w:t>
+      </w:r>
+      <w:r>
+        <w:t>The distribution documents the applicant spread for `fat_percentage` before modeling; the preprocessing action is: validate type, preserve for EDA, and feed through modeling pipeline.</w:t>
+      </w:r>
+    </w:p>
+    <w:p>
+      <w:pPr>
+        <w:pStyle w:val="Heading3"/>
+      </w:pPr>
+      <w:r>
+        <w:t>Univariate plot: insurance_cost</w:t>
+      </w:r>
+    </w:p>
+    <w:p>
+      <w:pPr>
+        <w:jc w:val="center"/>
+      </w:pPr>
+      <w:r>
+        <w:drawing>
+          <wp:inline xmlns:a="http://schemas.openxmlformats.org/drawingml/2006/main" xmlns:pic="http://schemas.openxmlformats.org/drawingml/2006/picture">
+            <wp:extent cx="5303520" cy="2993749"/>
+            <wp:docPr id="38" name="Picture 38"/>
+            <wp:cNvGraphicFramePr>
+              <a:graphicFrameLocks noChangeAspect="1"/>
+            </wp:cNvGraphicFramePr>
+            <a:graphic>
+              <a:graphicData uri="http://schemas.openxmlformats.org/drawingml/2006/picture">
+                <pic:pic>
+                  <pic:nvPicPr>
+                    <pic:cNvPr id="0" name="univariate_insurance_cost.png"/>
+                    <pic:cNvPicPr/>
+                  </pic:nvPicPr>
+                  <pic:blipFill>
+                    <a:blip r:embed="rId47"/>
+                    <a:stretch>
+                      <a:fillRect/>
+                    </a:stretch>
+                  </pic:blipFill>
+                  <pic:spPr>
+                    <a:xfrm>
+                      <a:off x="0" y="0"/>
+                      <a:ext cx="5303520" cy="2993749"/>
+                    </a:xfrm>
+                    <a:prstGeom prst="rect"/>
+                  </pic:spPr>
+                </pic:pic>
+              </a:graphicData>
+            </a:graphic>
+          </wp:inline>
+        </w:drawing>
+      </w:r>
+    </w:p>
+    <w:p>
+      <w:pPr>
+        <w:jc w:val="center"/>
+      </w:pPr>
+      <w:r>
+        <w:rPr>
+          <w:i/>
+          <w:color w:val="6B7280"/>
+          <w:sz w:val="17"/>
+        </w:rPr>
+        <w:t>Univariate distribution or frequency for insurance_cost.</w:t>
+      </w:r>
+    </w:p>
+    <w:p>
+      <w:r>
+        <w:rPr>
+          <w:b/>
+        </w:rPr>
+        <w:t xml:space="preserve">Technical interpretation: </w:t>
+      </w:r>
+      <w:r>
+        <w:t>`insurance_cost` ranges from 2,468 to 67,870, has 54 unique quote bands, and a grid step of 1,234.</w:t>
+      </w:r>
+    </w:p>
+    <w:p>
+      <w:r>
+        <w:rPr>
+          <w:b/>
+        </w:rPr>
+        <w:t xml:space="preserve">Business interpretation: </w:t>
+      </w:r>
+      <w:r>
+        <w:t>This is the prediction target; it behaves like a fixed quote-band grid, so deployment should show both raw prediction and nearest valid quote band.</w:t>
+      </w:r>
+    </w:p>
+    <w:p>
+      <w:pPr>
+        <w:pStyle w:val="Heading2"/>
+      </w:pPr>
+      <w:r>
         <w:t>Selected Group Summaries</w:t>
       </w:r>
     </w:p>
@@ -11848,7 +16010,7 @@
         <w:drawing>
           <wp:inline xmlns:a="http://schemas.openxmlformats.org/drawingml/2006/main" xmlns:pic="http://schemas.openxmlformats.org/drawingml/2006/picture">
             <wp:extent cx="5669280" cy="3358978"/>
-            <wp:docPr id="15" name="Picture 15"/>
+            <wp:docPr id="39" name="Picture 39"/>
             <wp:cNvGraphicFramePr>
               <a:graphicFrameLocks noChangeAspect="1"/>
             </wp:cNvGraphicFramePr>
@@ -11860,7 +16022,7 @@
                     <pic:cNvPicPr/>
                   </pic:nvPicPr>
                   <pic:blipFill>
-                    <a:blip r:embed="rId24"/>
+                    <a:blip r:embed="rId48"/>
                     <a:stretch>
                       <a:fillRect/>
                     </a:stretch>
@@ -11922,7 +16084,7 @@
         <w:drawing>
           <wp:inline xmlns:a="http://schemas.openxmlformats.org/drawingml/2006/main" xmlns:pic="http://schemas.openxmlformats.org/drawingml/2006/picture">
             <wp:extent cx="5669280" cy="3362996"/>
-            <wp:docPr id="16" name="Picture 16"/>
+            <wp:docPr id="40" name="Picture 40"/>
             <wp:cNvGraphicFramePr>
               <a:graphicFrameLocks noChangeAspect="1"/>
             </wp:cNvGraphicFramePr>
@@ -11934,7 +16096,7 @@
                     <pic:cNvPicPr/>
                   </pic:nvPicPr>
                   <pic:blipFill>
-                    <a:blip r:embed="rId25"/>
+                    <a:blip r:embed="rId49"/>
                     <a:stretch>
                       <a:fillRect/>
                     </a:stretch>
@@ -11996,7 +16158,7 @@
         <w:drawing>
           <wp:inline xmlns:a="http://schemas.openxmlformats.org/drawingml/2006/main" xmlns:pic="http://schemas.openxmlformats.org/drawingml/2006/picture">
             <wp:extent cx="5669280" cy="3358978"/>
-            <wp:docPr id="17" name="Picture 17"/>
+            <wp:docPr id="41" name="Picture 41"/>
             <wp:cNvGraphicFramePr>
               <a:graphicFrameLocks noChangeAspect="1"/>
             </wp:cNvGraphicFramePr>
@@ -12008,7 +16170,7 @@
                     <pic:cNvPicPr/>
                   </pic:nvPicPr>
                   <pic:blipFill>
-                    <a:blip r:embed="rId26"/>
+                    <a:blip r:embed="rId50"/>
                     <a:stretch>
                       <a:fillRect/>
                     </a:stretch>
@@ -12070,7 +16232,7 @@
         <w:drawing>
           <wp:inline xmlns:a="http://schemas.openxmlformats.org/drawingml/2006/main" xmlns:pic="http://schemas.openxmlformats.org/drawingml/2006/picture">
             <wp:extent cx="5669280" cy="3362996"/>
-            <wp:docPr id="18" name="Picture 18"/>
+            <wp:docPr id="42" name="Picture 42"/>
             <wp:cNvGraphicFramePr>
               <a:graphicFrameLocks noChangeAspect="1"/>
             </wp:cNvGraphicFramePr>
@@ -12082,7 +16244,7 @@
                     <pic:cNvPicPr/>
                   </pic:nvPicPr>
                   <pic:blipFill>
-                    <a:blip r:embed="rId27"/>
+                    <a:blip r:embed="rId51"/>
                     <a:stretch>
                       <a:fillRect/>
                     </a:stretch>
@@ -12144,7 +16306,7 @@
         <w:drawing>
           <wp:inline xmlns:a="http://schemas.openxmlformats.org/drawingml/2006/main" xmlns:pic="http://schemas.openxmlformats.org/drawingml/2006/picture">
             <wp:extent cx="5669280" cy="3358978"/>
-            <wp:docPr id="19" name="Picture 19"/>
+            <wp:docPr id="43" name="Picture 43"/>
             <wp:cNvGraphicFramePr>
               <a:graphicFrameLocks noChangeAspect="1"/>
             </wp:cNvGraphicFramePr>
@@ -12156,7 +16318,7 @@
                     <pic:cNvPicPr/>
                   </pic:nvPicPr>
                   <pic:blipFill>
-                    <a:blip r:embed="rId28"/>
+                    <a:blip r:embed="rId52"/>
                     <a:stretch>
                       <a:fillRect/>
                     </a:stretch>
@@ -12218,7 +16380,7 @@
         <w:drawing>
           <wp:inline xmlns:a="http://schemas.openxmlformats.org/drawingml/2006/main" xmlns:pic="http://schemas.openxmlformats.org/drawingml/2006/picture">
             <wp:extent cx="5669280" cy="3362996"/>
-            <wp:docPr id="20" name="Picture 20"/>
+            <wp:docPr id="44" name="Picture 44"/>
             <wp:cNvGraphicFramePr>
               <a:graphicFrameLocks noChangeAspect="1"/>
             </wp:cNvGraphicFramePr>
@@ -12230,7 +16392,7 @@
                     <pic:cNvPicPr/>
                   </pic:nvPicPr>
                   <pic:blipFill>
-                    <a:blip r:embed="rId29"/>
+                    <a:blip r:embed="rId53"/>
                     <a:stretch>
                       <a:fillRect/>
                     </a:stretch>
@@ -12292,7 +16454,7 @@
         <w:drawing>
           <wp:inline xmlns:a="http://schemas.openxmlformats.org/drawingml/2006/main" xmlns:pic="http://schemas.openxmlformats.org/drawingml/2006/picture">
             <wp:extent cx="5669280" cy="3318313"/>
-            <wp:docPr id="21" name="Picture 21"/>
+            <wp:docPr id="45" name="Picture 45"/>
             <wp:cNvGraphicFramePr>
               <a:graphicFrameLocks noChangeAspect="1"/>
             </wp:cNvGraphicFramePr>
@@ -12304,7 +16466,7 @@
                     <pic:cNvPicPr/>
                   </pic:nvPicPr>
                   <pic:blipFill>
-                    <a:blip r:embed="rId30"/>
+                    <a:blip r:embed="rId54"/>
                     <a:stretch>
                       <a:fillRect/>
                     </a:stretch>
@@ -12366,7 +16528,7 @@
         <w:drawing>
           <wp:inline xmlns:a="http://schemas.openxmlformats.org/drawingml/2006/main" xmlns:pic="http://schemas.openxmlformats.org/drawingml/2006/picture">
             <wp:extent cx="5669280" cy="3589400"/>
-            <wp:docPr id="22" name="Picture 22"/>
+            <wp:docPr id="46" name="Picture 46"/>
             <wp:cNvGraphicFramePr>
               <a:graphicFrameLocks noChangeAspect="1"/>
             </wp:cNvGraphicFramePr>
@@ -12378,7 +16540,7 @@
                     <pic:cNvPicPr/>
                   </pic:nvPicPr>
                   <pic:blipFill>
-                    <a:blip r:embed="rId31"/>
+                    <a:blip r:embed="rId55"/>
                     <a:stretch>
                       <a:fillRect/>
                     </a:stretch>

</xml_diff>

<commit_message>
Reduce report chart image sizes
</commit_message>
<xml_diff>
--- a/Milestone_1_Insurance_Price_Prediction.docx
+++ b/Milestone_1_Insurance_Price_Prediction.docx
@@ -1670,7 +1670,7 @@
       <w:r>
         <w:drawing>
           <wp:inline xmlns:a="http://schemas.openxmlformats.org/drawingml/2006/main" xmlns:pic="http://schemas.openxmlformats.org/drawingml/2006/picture">
-            <wp:extent cx="5669280" cy="2671472"/>
+            <wp:extent cx="4800600" cy="2262134"/>
             <wp:docPr id="1" name="Picture 1"/>
             <wp:cNvGraphicFramePr>
               <a:graphicFrameLocks noChangeAspect="1"/>
@@ -1691,7 +1691,7 @@
                   <pic:spPr>
                     <a:xfrm>
                       <a:off x="0" y="0"/>
-                      <a:ext cx="5669280" cy="2671472"/>
+                      <a:ext cx="4800600" cy="2262134"/>
                     </a:xfrm>
                     <a:prstGeom prst="rect"/>
                   </pic:spPr>
@@ -1903,7 +1903,7 @@
       <w:r>
         <w:drawing>
           <wp:inline xmlns:a="http://schemas.openxmlformats.org/drawingml/2006/main" xmlns:pic="http://schemas.openxmlformats.org/drawingml/2006/picture">
-            <wp:extent cx="5669280" cy="3020857"/>
+            <wp:extent cx="4800600" cy="2557984"/>
             <wp:docPr id="2" name="Picture 2"/>
             <wp:cNvGraphicFramePr>
               <a:graphicFrameLocks noChangeAspect="1"/>
@@ -1924,7 +1924,7 @@
                   <pic:spPr>
                     <a:xfrm>
                       <a:off x="0" y="0"/>
-                      <a:ext cx="5669280" cy="3020857"/>
+                      <a:ext cx="4800600" cy="2557984"/>
                     </a:xfrm>
                     <a:prstGeom prst="rect"/>
                   </pic:spPr>
@@ -5573,7 +5573,7 @@
       <w:r>
         <w:drawing>
           <wp:inline xmlns:a="http://schemas.openxmlformats.org/drawingml/2006/main" xmlns:pic="http://schemas.openxmlformats.org/drawingml/2006/picture">
-            <wp:extent cx="5669280" cy="3367770"/>
+            <wp:extent cx="4800600" cy="2851740"/>
             <wp:docPr id="3" name="Picture 3"/>
             <wp:cNvGraphicFramePr>
               <a:graphicFrameLocks noChangeAspect="1"/>
@@ -5594,7 +5594,7 @@
                   <pic:spPr>
                     <a:xfrm>
                       <a:off x="0" y="0"/>
-                      <a:ext cx="5669280" cy="3367770"/>
+                      <a:ext cx="4800600" cy="2851740"/>
                     </a:xfrm>
                     <a:prstGeom prst="rect"/>
                   </pic:spPr>
@@ -5647,7 +5647,7 @@
       <w:r>
         <w:drawing>
           <wp:inline xmlns:a="http://schemas.openxmlformats.org/drawingml/2006/main" xmlns:pic="http://schemas.openxmlformats.org/drawingml/2006/picture">
-            <wp:extent cx="5669280" cy="3197345"/>
+            <wp:extent cx="4800600" cy="2707429"/>
             <wp:docPr id="4" name="Picture 4"/>
             <wp:cNvGraphicFramePr>
               <a:graphicFrameLocks noChangeAspect="1"/>
@@ -5668,7 +5668,7 @@
                   <pic:spPr>
                     <a:xfrm>
                       <a:off x="0" y="0"/>
-                      <a:ext cx="5669280" cy="3197345"/>
+                      <a:ext cx="4800600" cy="2707429"/>
                     </a:xfrm>
                     <a:prstGeom prst="rect"/>
                   </pic:spPr>
@@ -7027,7 +7027,7 @@
       <w:r>
         <w:drawing>
           <wp:inline xmlns:a="http://schemas.openxmlformats.org/drawingml/2006/main" xmlns:pic="http://schemas.openxmlformats.org/drawingml/2006/picture">
-            <wp:extent cx="5669280" cy="2988683"/>
+            <wp:extent cx="4800600" cy="2530740"/>
             <wp:docPr id="5" name="Picture 5"/>
             <wp:cNvGraphicFramePr>
               <a:graphicFrameLocks noChangeAspect="1"/>
@@ -7048,7 +7048,7 @@
                   <pic:spPr>
                     <a:xfrm>
                       <a:off x="0" y="0"/>
-                      <a:ext cx="5669280" cy="2988683"/>
+                      <a:ext cx="4800600" cy="2530740"/>
                     </a:xfrm>
                     <a:prstGeom prst="rect"/>
                   </pic:spPr>
@@ -7109,7 +7109,7 @@
       <w:r>
         <w:drawing>
           <wp:inline xmlns:a="http://schemas.openxmlformats.org/drawingml/2006/main" xmlns:pic="http://schemas.openxmlformats.org/drawingml/2006/picture">
-            <wp:extent cx="5669280" cy="4144230"/>
+            <wp:extent cx="4800600" cy="3509227"/>
             <wp:docPr id="6" name="Picture 6"/>
             <wp:cNvGraphicFramePr>
               <a:graphicFrameLocks noChangeAspect="1"/>
@@ -7130,7 +7130,7 @@
                   <pic:spPr>
                     <a:xfrm>
                       <a:off x="0" y="0"/>
-                      <a:ext cx="5669280" cy="4144230"/>
+                      <a:ext cx="4800600" cy="3509227"/>
                     </a:xfrm>
                     <a:prstGeom prst="rect"/>
                   </pic:spPr>
@@ -7183,7 +7183,7 @@
       <w:r>
         <w:drawing>
           <wp:inline xmlns:a="http://schemas.openxmlformats.org/drawingml/2006/main" xmlns:pic="http://schemas.openxmlformats.org/drawingml/2006/picture">
-            <wp:extent cx="5669280" cy="3297323"/>
+            <wp:extent cx="4800600" cy="2792088"/>
             <wp:docPr id="7" name="Picture 7"/>
             <wp:cNvGraphicFramePr>
               <a:graphicFrameLocks noChangeAspect="1"/>
@@ -7204,7 +7204,7 @@
                   <pic:spPr>
                     <a:xfrm>
                       <a:off x="0" y="0"/>
-                      <a:ext cx="5669280" cy="3297323"/>
+                      <a:ext cx="4800600" cy="2792088"/>
                     </a:xfrm>
                     <a:prstGeom prst="rect"/>
                   </pic:spPr>
@@ -7257,7 +7257,7 @@
       <w:r>
         <w:drawing>
           <wp:inline xmlns:a="http://schemas.openxmlformats.org/drawingml/2006/main" xmlns:pic="http://schemas.openxmlformats.org/drawingml/2006/picture">
-            <wp:extent cx="5669280" cy="2982519"/>
+            <wp:extent cx="4800600" cy="2525520"/>
             <wp:docPr id="8" name="Picture 8"/>
             <wp:cNvGraphicFramePr>
               <a:graphicFrameLocks noChangeAspect="1"/>
@@ -7278,7 +7278,7 @@
                   <pic:spPr>
                     <a:xfrm>
                       <a:off x="0" y="0"/>
-                      <a:ext cx="5669280" cy="2982519"/>
+                      <a:ext cx="4800600" cy="2525520"/>
                     </a:xfrm>
                     <a:prstGeom prst="rect"/>
                   </pic:spPr>
@@ -7331,7 +7331,7 @@
       <w:r>
         <w:drawing>
           <wp:inline xmlns:a="http://schemas.openxmlformats.org/drawingml/2006/main" xmlns:pic="http://schemas.openxmlformats.org/drawingml/2006/picture">
-            <wp:extent cx="5669280" cy="2978955"/>
+            <wp:extent cx="4800600" cy="2522503"/>
             <wp:docPr id="9" name="Picture 9"/>
             <wp:cNvGraphicFramePr>
               <a:graphicFrameLocks noChangeAspect="1"/>
@@ -7352,7 +7352,7 @@
                   <pic:spPr>
                     <a:xfrm>
                       <a:off x="0" y="0"/>
-                      <a:ext cx="5669280" cy="2978955"/>
+                      <a:ext cx="4800600" cy="2522503"/>
                     </a:xfrm>
                     <a:prstGeom prst="rect"/>
                   </pic:spPr>
@@ -7405,7 +7405,7 @@
       <w:r>
         <w:drawing>
           <wp:inline xmlns:a="http://schemas.openxmlformats.org/drawingml/2006/main" xmlns:pic="http://schemas.openxmlformats.org/drawingml/2006/picture">
-            <wp:extent cx="5669280" cy="2977084"/>
+            <wp:extent cx="4800600" cy="2520918"/>
             <wp:docPr id="10" name="Picture 10"/>
             <wp:cNvGraphicFramePr>
               <a:graphicFrameLocks noChangeAspect="1"/>
@@ -7426,7 +7426,7 @@
                   <pic:spPr>
                     <a:xfrm>
                       <a:off x="0" y="0"/>
-                      <a:ext cx="5669280" cy="2977084"/>
+                      <a:ext cx="4800600" cy="2520918"/>
                     </a:xfrm>
                     <a:prstGeom prst="rect"/>
                   </pic:spPr>
@@ -7479,7 +7479,7 @@
       <w:r>
         <w:drawing>
           <wp:inline xmlns:a="http://schemas.openxmlformats.org/drawingml/2006/main" xmlns:pic="http://schemas.openxmlformats.org/drawingml/2006/picture">
-            <wp:extent cx="5669280" cy="3430729"/>
+            <wp:extent cx="4800600" cy="2905053"/>
             <wp:docPr id="11" name="Picture 11"/>
             <wp:cNvGraphicFramePr>
               <a:graphicFrameLocks noChangeAspect="1"/>
@@ -7500,7 +7500,7 @@
                   <pic:spPr>
                     <a:xfrm>
                       <a:off x="0" y="0"/>
-                      <a:ext cx="5669280" cy="3430729"/>
+                      <a:ext cx="4800600" cy="2905053"/>
                     </a:xfrm>
                     <a:prstGeom prst="rect"/>
                   </pic:spPr>
@@ -7553,7 +7553,7 @@
       <w:r>
         <w:drawing>
           <wp:inline xmlns:a="http://schemas.openxmlformats.org/drawingml/2006/main" xmlns:pic="http://schemas.openxmlformats.org/drawingml/2006/picture">
-            <wp:extent cx="5669280" cy="3430729"/>
+            <wp:extent cx="4800600" cy="2905053"/>
             <wp:docPr id="12" name="Picture 12"/>
             <wp:cNvGraphicFramePr>
               <a:graphicFrameLocks noChangeAspect="1"/>
@@ -7574,7 +7574,7 @@
                   <pic:spPr>
                     <a:xfrm>
                       <a:off x="0" y="0"/>
-                      <a:ext cx="5669280" cy="3430729"/>
+                      <a:ext cx="4800600" cy="2905053"/>
                     </a:xfrm>
                     <a:prstGeom prst="rect"/>
                   </pic:spPr>
@@ -7627,7 +7627,7 @@
       <w:r>
         <w:drawing>
           <wp:inline xmlns:a="http://schemas.openxmlformats.org/drawingml/2006/main" xmlns:pic="http://schemas.openxmlformats.org/drawingml/2006/picture">
-            <wp:extent cx="5669280" cy="3430729"/>
+            <wp:extent cx="4800600" cy="2905053"/>
             <wp:docPr id="13" name="Picture 13"/>
             <wp:cNvGraphicFramePr>
               <a:graphicFrameLocks noChangeAspect="1"/>
@@ -7648,7 +7648,7 @@
                   <pic:spPr>
                     <a:xfrm>
                       <a:off x="0" y="0"/>
-                      <a:ext cx="5669280" cy="3430729"/>
+                      <a:ext cx="4800600" cy="2905053"/>
                     </a:xfrm>
                     <a:prstGeom prst="rect"/>
                   </pic:spPr>
@@ -7701,7 +7701,7 @@
       <w:r>
         <w:drawing>
           <wp:inline xmlns:a="http://schemas.openxmlformats.org/drawingml/2006/main" xmlns:pic="http://schemas.openxmlformats.org/drawingml/2006/picture">
-            <wp:extent cx="5669280" cy="3277063"/>
+            <wp:extent cx="4800600" cy="2774932"/>
             <wp:docPr id="14" name="Picture 14"/>
             <wp:cNvGraphicFramePr>
               <a:graphicFrameLocks noChangeAspect="1"/>
@@ -7722,7 +7722,7 @@
                   <pic:spPr>
                     <a:xfrm>
                       <a:off x="0" y="0"/>
-                      <a:ext cx="5669280" cy="3277063"/>
+                      <a:ext cx="4800600" cy="2774932"/>
                     </a:xfrm>
                     <a:prstGeom prst="rect"/>
                   </pic:spPr>
@@ -11539,7 +11539,7 @@
       <w:r>
         <w:drawing>
           <wp:inline xmlns:a="http://schemas.openxmlformats.org/drawingml/2006/main" xmlns:pic="http://schemas.openxmlformats.org/drawingml/2006/picture">
-            <wp:extent cx="5303520" cy="3049106"/>
+            <wp:extent cx="4343400" cy="2497112"/>
             <wp:docPr id="15" name="Picture 15"/>
             <wp:cNvGraphicFramePr>
               <a:graphicFrameLocks noChangeAspect="1"/>
@@ -11560,7 +11560,7 @@
                   <pic:spPr>
                     <a:xfrm>
                       <a:off x="0" y="0"/>
-                      <a:ext cx="5303520" cy="3049106"/>
+                      <a:ext cx="4343400" cy="2497112"/>
                     </a:xfrm>
                     <a:prstGeom prst="rect"/>
                   </pic:spPr>
@@ -11621,7 +11621,7 @@
       <w:r>
         <w:drawing>
           <wp:inline xmlns:a="http://schemas.openxmlformats.org/drawingml/2006/main" xmlns:pic="http://schemas.openxmlformats.org/drawingml/2006/picture">
-            <wp:extent cx="5303520" cy="2916936"/>
+            <wp:extent cx="4343400" cy="2388870"/>
             <wp:docPr id="16" name="Picture 16"/>
             <wp:cNvGraphicFramePr>
               <a:graphicFrameLocks noChangeAspect="1"/>
@@ -11642,7 +11642,7 @@
                   <pic:spPr>
                     <a:xfrm>
                       <a:off x="0" y="0"/>
-                      <a:ext cx="5303520" cy="2916936"/>
+                      <a:ext cx="4343400" cy="2388870"/>
                     </a:xfrm>
                     <a:prstGeom prst="rect"/>
                   </pic:spPr>
@@ -11703,7 +11703,7 @@
       <w:r>
         <w:drawing>
           <wp:inline xmlns:a="http://schemas.openxmlformats.org/drawingml/2006/main" xmlns:pic="http://schemas.openxmlformats.org/drawingml/2006/picture">
-            <wp:extent cx="5303520" cy="2916936"/>
+            <wp:extent cx="4343400" cy="2388870"/>
             <wp:docPr id="17" name="Picture 17"/>
             <wp:cNvGraphicFramePr>
               <a:graphicFrameLocks noChangeAspect="1"/>
@@ -11724,7 +11724,7 @@
                   <pic:spPr>
                     <a:xfrm>
                       <a:off x="0" y="0"/>
-                      <a:ext cx="5303520" cy="2916936"/>
+                      <a:ext cx="4343400" cy="2388870"/>
                     </a:xfrm>
                     <a:prstGeom prst="rect"/>
                   </pic:spPr>
@@ -11785,7 +11785,7 @@
       <w:r>
         <w:drawing>
           <wp:inline xmlns:a="http://schemas.openxmlformats.org/drawingml/2006/main" xmlns:pic="http://schemas.openxmlformats.org/drawingml/2006/picture">
-            <wp:extent cx="5303520" cy="2916936"/>
+            <wp:extent cx="4343400" cy="2388870"/>
             <wp:docPr id="18" name="Picture 18"/>
             <wp:cNvGraphicFramePr>
               <a:graphicFrameLocks noChangeAspect="1"/>
@@ -11806,7 +11806,7 @@
                   <pic:spPr>
                     <a:xfrm>
                       <a:off x="0" y="0"/>
-                      <a:ext cx="5303520" cy="2916936"/>
+                      <a:ext cx="4343400" cy="2388870"/>
                     </a:xfrm>
                     <a:prstGeom prst="rect"/>
                   </pic:spPr>
@@ -11867,7 +11867,7 @@
       <w:r>
         <w:drawing>
           <wp:inline xmlns:a="http://schemas.openxmlformats.org/drawingml/2006/main" xmlns:pic="http://schemas.openxmlformats.org/drawingml/2006/picture">
-            <wp:extent cx="5303520" cy="2918857"/>
+            <wp:extent cx="4343400" cy="2390443"/>
             <wp:docPr id="19" name="Picture 19"/>
             <wp:cNvGraphicFramePr>
               <a:graphicFrameLocks noChangeAspect="1"/>
@@ -11888,7 +11888,7 @@
                   <pic:spPr>
                     <a:xfrm>
                       <a:off x="0" y="0"/>
-                      <a:ext cx="5303520" cy="2918857"/>
+                      <a:ext cx="4343400" cy="2390443"/>
                     </a:xfrm>
                     <a:prstGeom prst="rect"/>
                   </pic:spPr>
@@ -11949,7 +11949,7 @@
       <w:r>
         <w:drawing>
           <wp:inline xmlns:a="http://schemas.openxmlformats.org/drawingml/2006/main" xmlns:pic="http://schemas.openxmlformats.org/drawingml/2006/picture">
-            <wp:extent cx="5303520" cy="2918857"/>
+            <wp:extent cx="4343400" cy="2390443"/>
             <wp:docPr id="20" name="Picture 20"/>
             <wp:cNvGraphicFramePr>
               <a:graphicFrameLocks noChangeAspect="1"/>
@@ -11970,7 +11970,7 @@
                   <pic:spPr>
                     <a:xfrm>
                       <a:off x="0" y="0"/>
-                      <a:ext cx="5303520" cy="2918857"/>
+                      <a:ext cx="4343400" cy="2390443"/>
                     </a:xfrm>
                     <a:prstGeom prst="rect"/>
                   </pic:spPr>
@@ -12031,7 +12031,7 @@
       <w:r>
         <w:drawing>
           <wp:inline xmlns:a="http://schemas.openxmlformats.org/drawingml/2006/main" xmlns:pic="http://schemas.openxmlformats.org/drawingml/2006/picture">
-            <wp:extent cx="5303520" cy="2918857"/>
+            <wp:extent cx="4343400" cy="2390443"/>
             <wp:docPr id="21" name="Picture 21"/>
             <wp:cNvGraphicFramePr>
               <a:graphicFrameLocks noChangeAspect="1"/>
@@ -12052,7 +12052,7 @@
                   <pic:spPr>
                     <a:xfrm>
                       <a:off x="0" y="0"/>
-                      <a:ext cx="5303520" cy="2918857"/>
+                      <a:ext cx="4343400" cy="2390443"/>
                     </a:xfrm>
                     <a:prstGeom prst="rect"/>
                   </pic:spPr>
@@ -12113,7 +12113,7 @@
       <w:r>
         <w:drawing>
           <wp:inline xmlns:a="http://schemas.openxmlformats.org/drawingml/2006/main" xmlns:pic="http://schemas.openxmlformats.org/drawingml/2006/picture">
-            <wp:extent cx="5303520" cy="2178873"/>
+            <wp:extent cx="4343400" cy="1784422"/>
             <wp:docPr id="22" name="Picture 22"/>
             <wp:cNvGraphicFramePr>
               <a:graphicFrameLocks noChangeAspect="1"/>
@@ -12134,7 +12134,7 @@
                   <pic:spPr>
                     <a:xfrm>
                       <a:off x="0" y="0"/>
-                      <a:ext cx="5303520" cy="2178873"/>
+                      <a:ext cx="4343400" cy="1784422"/>
                     </a:xfrm>
                     <a:prstGeom prst="rect"/>
                   </pic:spPr>
@@ -12195,7 +12195,7 @@
       <w:r>
         <w:drawing>
           <wp:inline xmlns:a="http://schemas.openxmlformats.org/drawingml/2006/main" xmlns:pic="http://schemas.openxmlformats.org/drawingml/2006/picture">
-            <wp:extent cx="5303520" cy="2183098"/>
+            <wp:extent cx="4343400" cy="1787882"/>
             <wp:docPr id="23" name="Picture 23"/>
             <wp:cNvGraphicFramePr>
               <a:graphicFrameLocks noChangeAspect="1"/>
@@ -12216,7 +12216,7 @@
                   <pic:spPr>
                     <a:xfrm>
                       <a:off x="0" y="0"/>
-                      <a:ext cx="5303520" cy="2183098"/>
+                      <a:ext cx="4343400" cy="1787882"/>
                     </a:xfrm>
                     <a:prstGeom prst="rect"/>
                   </pic:spPr>
@@ -12277,7 +12277,7 @@
       <w:r>
         <w:drawing>
           <wp:inline xmlns:a="http://schemas.openxmlformats.org/drawingml/2006/main" xmlns:pic="http://schemas.openxmlformats.org/drawingml/2006/picture">
-            <wp:extent cx="5303520" cy="2916936"/>
+            <wp:extent cx="4343400" cy="2388870"/>
             <wp:docPr id="24" name="Picture 24"/>
             <wp:cNvGraphicFramePr>
               <a:graphicFrameLocks noChangeAspect="1"/>
@@ -12298,7 +12298,7 @@
                   <pic:spPr>
                     <a:xfrm>
                       <a:off x="0" y="0"/>
-                      <a:ext cx="5303520" cy="2916936"/>
+                      <a:ext cx="4343400" cy="2388870"/>
                     </a:xfrm>
                     <a:prstGeom prst="rect"/>
                   </pic:spPr>
@@ -12359,7 +12359,7 @@
       <w:r>
         <w:drawing>
           <wp:inline xmlns:a="http://schemas.openxmlformats.org/drawingml/2006/main" xmlns:pic="http://schemas.openxmlformats.org/drawingml/2006/picture">
-            <wp:extent cx="5303520" cy="2916936"/>
+            <wp:extent cx="4343400" cy="2388870"/>
             <wp:docPr id="25" name="Picture 25"/>
             <wp:cNvGraphicFramePr>
               <a:graphicFrameLocks noChangeAspect="1"/>
@@ -12380,7 +12380,7 @@
                   <pic:spPr>
                     <a:xfrm>
                       <a:off x="0" y="0"/>
-                      <a:ext cx="5303520" cy="2916936"/>
+                      <a:ext cx="4343400" cy="2388870"/>
                     </a:xfrm>
                     <a:prstGeom prst="rect"/>
                   </pic:spPr>
@@ -12441,7 +12441,7 @@
       <w:r>
         <w:drawing>
           <wp:inline xmlns:a="http://schemas.openxmlformats.org/drawingml/2006/main" xmlns:pic="http://schemas.openxmlformats.org/drawingml/2006/picture">
-            <wp:extent cx="5303520" cy="2922348"/>
+            <wp:extent cx="4343400" cy="2393302"/>
             <wp:docPr id="26" name="Picture 26"/>
             <wp:cNvGraphicFramePr>
               <a:graphicFrameLocks noChangeAspect="1"/>
@@ -12462,7 +12462,7 @@
                   <pic:spPr>
                     <a:xfrm>
                       <a:off x="0" y="0"/>
-                      <a:ext cx="5303520" cy="2922348"/>
+                      <a:ext cx="4343400" cy="2393302"/>
                     </a:xfrm>
                     <a:prstGeom prst="rect"/>
                   </pic:spPr>
@@ -12523,7 +12523,7 @@
       <w:r>
         <w:drawing>
           <wp:inline xmlns:a="http://schemas.openxmlformats.org/drawingml/2006/main" xmlns:pic="http://schemas.openxmlformats.org/drawingml/2006/picture">
-            <wp:extent cx="5303520" cy="2178873"/>
+            <wp:extent cx="4343400" cy="1784422"/>
             <wp:docPr id="27" name="Picture 27"/>
             <wp:cNvGraphicFramePr>
               <a:graphicFrameLocks noChangeAspect="1"/>
@@ -12544,7 +12544,7 @@
                   <pic:spPr>
                     <a:xfrm>
                       <a:off x="0" y="0"/>
-                      <a:ext cx="5303520" cy="2178873"/>
+                      <a:ext cx="4343400" cy="1784422"/>
                     </a:xfrm>
                     <a:prstGeom prst="rect"/>
                   </pic:spPr>
@@ -12605,7 +12605,7 @@
       <w:r>
         <w:drawing>
           <wp:inline xmlns:a="http://schemas.openxmlformats.org/drawingml/2006/main" xmlns:pic="http://schemas.openxmlformats.org/drawingml/2006/picture">
-            <wp:extent cx="5303520" cy="2181866"/>
+            <wp:extent cx="4343400" cy="1786873"/>
             <wp:docPr id="28" name="Picture 28"/>
             <wp:cNvGraphicFramePr>
               <a:graphicFrameLocks noChangeAspect="1"/>
@@ -12626,7 +12626,7 @@
                   <pic:spPr>
                     <a:xfrm>
                       <a:off x="0" y="0"/>
-                      <a:ext cx="5303520" cy="2181866"/>
+                      <a:ext cx="4343400" cy="1786873"/>
                     </a:xfrm>
                     <a:prstGeom prst="rect"/>
                   </pic:spPr>
@@ -12687,7 +12687,7 @@
       <w:r>
         <w:drawing>
           <wp:inline xmlns:a="http://schemas.openxmlformats.org/drawingml/2006/main" xmlns:pic="http://schemas.openxmlformats.org/drawingml/2006/picture">
-            <wp:extent cx="5303520" cy="2918857"/>
+            <wp:extent cx="4343400" cy="2390443"/>
             <wp:docPr id="29" name="Picture 29"/>
             <wp:cNvGraphicFramePr>
               <a:graphicFrameLocks noChangeAspect="1"/>
@@ -12708,7 +12708,7 @@
                   <pic:spPr>
                     <a:xfrm>
                       <a:off x="0" y="0"/>
-                      <a:ext cx="5303520" cy="2918857"/>
+                      <a:ext cx="4343400" cy="2390443"/>
                     </a:xfrm>
                     <a:prstGeom prst="rect"/>
                   </pic:spPr>
@@ -12769,7 +12769,7 @@
       <w:r>
         <w:drawing>
           <wp:inline xmlns:a="http://schemas.openxmlformats.org/drawingml/2006/main" xmlns:pic="http://schemas.openxmlformats.org/drawingml/2006/picture">
-            <wp:extent cx="5303520" cy="2918857"/>
+            <wp:extent cx="4343400" cy="2390443"/>
             <wp:docPr id="30" name="Picture 30"/>
             <wp:cNvGraphicFramePr>
               <a:graphicFrameLocks noChangeAspect="1"/>
@@ -12790,7 +12790,7 @@
                   <pic:spPr>
                     <a:xfrm>
                       <a:off x="0" y="0"/>
-                      <a:ext cx="5303520" cy="2918857"/>
+                      <a:ext cx="4343400" cy="2390443"/>
                     </a:xfrm>
                     <a:prstGeom prst="rect"/>
                   </pic:spPr>
@@ -12851,7 +12851,7 @@
       <w:r>
         <w:drawing>
           <wp:inline xmlns:a="http://schemas.openxmlformats.org/drawingml/2006/main" xmlns:pic="http://schemas.openxmlformats.org/drawingml/2006/picture">
-            <wp:extent cx="5303520" cy="2916936"/>
+            <wp:extent cx="4343400" cy="2388870"/>
             <wp:docPr id="31" name="Picture 31"/>
             <wp:cNvGraphicFramePr>
               <a:graphicFrameLocks noChangeAspect="1"/>
@@ -12872,7 +12872,7 @@
                   <pic:spPr>
                     <a:xfrm>
                       <a:off x="0" y="0"/>
-                      <a:ext cx="5303520" cy="2916936"/>
+                      <a:ext cx="4343400" cy="2388870"/>
                     </a:xfrm>
                     <a:prstGeom prst="rect"/>
                   </pic:spPr>
@@ -12933,7 +12933,7 @@
       <w:r>
         <w:drawing>
           <wp:inline xmlns:a="http://schemas.openxmlformats.org/drawingml/2006/main" xmlns:pic="http://schemas.openxmlformats.org/drawingml/2006/picture">
-            <wp:extent cx="5303520" cy="2181866"/>
+            <wp:extent cx="4343400" cy="1786873"/>
             <wp:docPr id="32" name="Picture 32"/>
             <wp:cNvGraphicFramePr>
               <a:graphicFrameLocks noChangeAspect="1"/>
@@ -12954,7 +12954,7 @@
                   <pic:spPr>
                     <a:xfrm>
                       <a:off x="0" y="0"/>
-                      <a:ext cx="5303520" cy="2181866"/>
+                      <a:ext cx="4343400" cy="1786873"/>
                     </a:xfrm>
                     <a:prstGeom prst="rect"/>
                   </pic:spPr>
@@ -13015,7 +13015,7 @@
       <w:r>
         <w:drawing>
           <wp:inline xmlns:a="http://schemas.openxmlformats.org/drawingml/2006/main" xmlns:pic="http://schemas.openxmlformats.org/drawingml/2006/picture">
-            <wp:extent cx="5303520" cy="2918857"/>
+            <wp:extent cx="4343400" cy="2390443"/>
             <wp:docPr id="33" name="Picture 33"/>
             <wp:cNvGraphicFramePr>
               <a:graphicFrameLocks noChangeAspect="1"/>
@@ -13036,7 +13036,7 @@
                   <pic:spPr>
                     <a:xfrm>
                       <a:off x="0" y="0"/>
-                      <a:ext cx="5303520" cy="2918857"/>
+                      <a:ext cx="4343400" cy="2390443"/>
                     </a:xfrm>
                     <a:prstGeom prst="rect"/>
                   </pic:spPr>
@@ -13097,7 +13097,7 @@
       <w:r>
         <w:drawing>
           <wp:inline xmlns:a="http://schemas.openxmlformats.org/drawingml/2006/main" xmlns:pic="http://schemas.openxmlformats.org/drawingml/2006/picture">
-            <wp:extent cx="5303520" cy="2920425"/>
+            <wp:extent cx="4343400" cy="2391728"/>
             <wp:docPr id="34" name="Picture 34"/>
             <wp:cNvGraphicFramePr>
               <a:graphicFrameLocks noChangeAspect="1"/>
@@ -13118,7 +13118,7 @@
                   <pic:spPr>
                     <a:xfrm>
                       <a:off x="0" y="0"/>
-                      <a:ext cx="5303520" cy="2920425"/>
+                      <a:ext cx="4343400" cy="2391728"/>
                     </a:xfrm>
                     <a:prstGeom prst="rect"/>
                   </pic:spPr>
@@ -13179,7 +13179,7 @@
       <w:r>
         <w:drawing>
           <wp:inline xmlns:a="http://schemas.openxmlformats.org/drawingml/2006/main" xmlns:pic="http://schemas.openxmlformats.org/drawingml/2006/picture">
-            <wp:extent cx="5303520" cy="2920425"/>
+            <wp:extent cx="4343400" cy="2391728"/>
             <wp:docPr id="35" name="Picture 35"/>
             <wp:cNvGraphicFramePr>
               <a:graphicFrameLocks noChangeAspect="1"/>
@@ -13200,7 +13200,7 @@
                   <pic:spPr>
                     <a:xfrm>
                       <a:off x="0" y="0"/>
-                      <a:ext cx="5303520" cy="2920425"/>
+                      <a:ext cx="4343400" cy="2391728"/>
                     </a:xfrm>
                     <a:prstGeom prst="rect"/>
                   </pic:spPr>
@@ -13261,7 +13261,7 @@
       <w:r>
         <w:drawing>
           <wp:inline xmlns:a="http://schemas.openxmlformats.org/drawingml/2006/main" xmlns:pic="http://schemas.openxmlformats.org/drawingml/2006/picture">
-            <wp:extent cx="5303520" cy="2916936"/>
+            <wp:extent cx="4343400" cy="2388870"/>
             <wp:docPr id="36" name="Picture 36"/>
             <wp:cNvGraphicFramePr>
               <a:graphicFrameLocks noChangeAspect="1"/>
@@ -13282,7 +13282,7 @@
                   <pic:spPr>
                     <a:xfrm>
                       <a:off x="0" y="0"/>
-                      <a:ext cx="5303520" cy="2916936"/>
+                      <a:ext cx="4343400" cy="2388870"/>
                     </a:xfrm>
                     <a:prstGeom prst="rect"/>
                   </pic:spPr>
@@ -13343,7 +13343,7 @@
       <w:r>
         <w:drawing>
           <wp:inline xmlns:a="http://schemas.openxmlformats.org/drawingml/2006/main" xmlns:pic="http://schemas.openxmlformats.org/drawingml/2006/picture">
-            <wp:extent cx="5303520" cy="2178873"/>
+            <wp:extent cx="4343400" cy="1784422"/>
             <wp:docPr id="37" name="Picture 37"/>
             <wp:cNvGraphicFramePr>
               <a:graphicFrameLocks noChangeAspect="1"/>
@@ -13364,7 +13364,7 @@
                   <pic:spPr>
                     <a:xfrm>
                       <a:off x="0" y="0"/>
-                      <a:ext cx="5303520" cy="2178873"/>
+                      <a:ext cx="4343400" cy="1784422"/>
                     </a:xfrm>
                     <a:prstGeom prst="rect"/>
                   </pic:spPr>
@@ -13425,7 +13425,7 @@
       <w:r>
         <w:drawing>
           <wp:inline xmlns:a="http://schemas.openxmlformats.org/drawingml/2006/main" xmlns:pic="http://schemas.openxmlformats.org/drawingml/2006/picture">
-            <wp:extent cx="5303520" cy="2993749"/>
+            <wp:extent cx="4343400" cy="2451777"/>
             <wp:docPr id="38" name="Picture 38"/>
             <wp:cNvGraphicFramePr>
               <a:graphicFrameLocks noChangeAspect="1"/>
@@ -13446,7 +13446,7 @@
                   <pic:spPr>
                     <a:xfrm>
                       <a:off x="0" y="0"/>
-                      <a:ext cx="5303520" cy="2993749"/>
+                      <a:ext cx="4343400" cy="2451777"/>
                     </a:xfrm>
                     <a:prstGeom prst="rect"/>
                   </pic:spPr>
@@ -16009,7 +16009,7 @@
       <w:r>
         <w:drawing>
           <wp:inline xmlns:a="http://schemas.openxmlformats.org/drawingml/2006/main" xmlns:pic="http://schemas.openxmlformats.org/drawingml/2006/picture">
-            <wp:extent cx="5669280" cy="3358978"/>
+            <wp:extent cx="4800600" cy="2844296"/>
             <wp:docPr id="39" name="Picture 39"/>
             <wp:cNvGraphicFramePr>
               <a:graphicFrameLocks noChangeAspect="1"/>
@@ -16030,7 +16030,7 @@
                   <pic:spPr>
                     <a:xfrm>
                       <a:off x="0" y="0"/>
-                      <a:ext cx="5669280" cy="3358978"/>
+                      <a:ext cx="4800600" cy="2844296"/>
                     </a:xfrm>
                     <a:prstGeom prst="rect"/>
                   </pic:spPr>
@@ -16083,7 +16083,7 @@
       <w:r>
         <w:drawing>
           <wp:inline xmlns:a="http://schemas.openxmlformats.org/drawingml/2006/main" xmlns:pic="http://schemas.openxmlformats.org/drawingml/2006/picture">
-            <wp:extent cx="5669280" cy="3362996"/>
+            <wp:extent cx="4800600" cy="2847698"/>
             <wp:docPr id="40" name="Picture 40"/>
             <wp:cNvGraphicFramePr>
               <a:graphicFrameLocks noChangeAspect="1"/>
@@ -16104,7 +16104,7 @@
                   <pic:spPr>
                     <a:xfrm>
                       <a:off x="0" y="0"/>
-                      <a:ext cx="5669280" cy="3362996"/>
+                      <a:ext cx="4800600" cy="2847698"/>
                     </a:xfrm>
                     <a:prstGeom prst="rect"/>
                   </pic:spPr>
@@ -16157,7 +16157,7 @@
       <w:r>
         <w:drawing>
           <wp:inline xmlns:a="http://schemas.openxmlformats.org/drawingml/2006/main" xmlns:pic="http://schemas.openxmlformats.org/drawingml/2006/picture">
-            <wp:extent cx="5669280" cy="3358978"/>
+            <wp:extent cx="4800600" cy="2844296"/>
             <wp:docPr id="41" name="Picture 41"/>
             <wp:cNvGraphicFramePr>
               <a:graphicFrameLocks noChangeAspect="1"/>
@@ -16178,7 +16178,7 @@
                   <pic:spPr>
                     <a:xfrm>
                       <a:off x="0" y="0"/>
-                      <a:ext cx="5669280" cy="3358978"/>
+                      <a:ext cx="4800600" cy="2844296"/>
                     </a:xfrm>
                     <a:prstGeom prst="rect"/>
                   </pic:spPr>
@@ -16231,7 +16231,7 @@
       <w:r>
         <w:drawing>
           <wp:inline xmlns:a="http://schemas.openxmlformats.org/drawingml/2006/main" xmlns:pic="http://schemas.openxmlformats.org/drawingml/2006/picture">
-            <wp:extent cx="5669280" cy="3362996"/>
+            <wp:extent cx="4800600" cy="2847698"/>
             <wp:docPr id="42" name="Picture 42"/>
             <wp:cNvGraphicFramePr>
               <a:graphicFrameLocks noChangeAspect="1"/>
@@ -16252,7 +16252,7 @@
                   <pic:spPr>
                     <a:xfrm>
                       <a:off x="0" y="0"/>
-                      <a:ext cx="5669280" cy="3362996"/>
+                      <a:ext cx="4800600" cy="2847698"/>
                     </a:xfrm>
                     <a:prstGeom prst="rect"/>
                   </pic:spPr>
@@ -16305,7 +16305,7 @@
       <w:r>
         <w:drawing>
           <wp:inline xmlns:a="http://schemas.openxmlformats.org/drawingml/2006/main" xmlns:pic="http://schemas.openxmlformats.org/drawingml/2006/picture">
-            <wp:extent cx="5669280" cy="3358978"/>
+            <wp:extent cx="4800600" cy="2844296"/>
             <wp:docPr id="43" name="Picture 43"/>
             <wp:cNvGraphicFramePr>
               <a:graphicFrameLocks noChangeAspect="1"/>
@@ -16326,7 +16326,7 @@
                   <pic:spPr>
                     <a:xfrm>
                       <a:off x="0" y="0"/>
-                      <a:ext cx="5669280" cy="3358978"/>
+                      <a:ext cx="4800600" cy="2844296"/>
                     </a:xfrm>
                     <a:prstGeom prst="rect"/>
                   </pic:spPr>
@@ -16379,7 +16379,7 @@
       <w:r>
         <w:drawing>
           <wp:inline xmlns:a="http://schemas.openxmlformats.org/drawingml/2006/main" xmlns:pic="http://schemas.openxmlformats.org/drawingml/2006/picture">
-            <wp:extent cx="5669280" cy="3362996"/>
+            <wp:extent cx="4800600" cy="2847698"/>
             <wp:docPr id="44" name="Picture 44"/>
             <wp:cNvGraphicFramePr>
               <a:graphicFrameLocks noChangeAspect="1"/>
@@ -16400,7 +16400,7 @@
                   <pic:spPr>
                     <a:xfrm>
                       <a:off x="0" y="0"/>
-                      <a:ext cx="5669280" cy="3362996"/>
+                      <a:ext cx="4800600" cy="2847698"/>
                     </a:xfrm>
                     <a:prstGeom prst="rect"/>
                   </pic:spPr>
@@ -16453,7 +16453,7 @@
       <w:r>
         <w:drawing>
           <wp:inline xmlns:a="http://schemas.openxmlformats.org/drawingml/2006/main" xmlns:pic="http://schemas.openxmlformats.org/drawingml/2006/picture">
-            <wp:extent cx="5669280" cy="3318313"/>
+            <wp:extent cx="4800600" cy="2809862"/>
             <wp:docPr id="45" name="Picture 45"/>
             <wp:cNvGraphicFramePr>
               <a:graphicFrameLocks noChangeAspect="1"/>
@@ -16474,7 +16474,7 @@
                   <pic:spPr>
                     <a:xfrm>
                       <a:off x="0" y="0"/>
-                      <a:ext cx="5669280" cy="3318313"/>
+                      <a:ext cx="4800600" cy="2809862"/>
                     </a:xfrm>
                     <a:prstGeom prst="rect"/>
                   </pic:spPr>
@@ -16527,7 +16527,7 @@
       <w:r>
         <w:drawing>
           <wp:inline xmlns:a="http://schemas.openxmlformats.org/drawingml/2006/main" xmlns:pic="http://schemas.openxmlformats.org/drawingml/2006/picture">
-            <wp:extent cx="5669280" cy="3589400"/>
+            <wp:extent cx="4800600" cy="3039412"/>
             <wp:docPr id="46" name="Picture 46"/>
             <wp:cNvGraphicFramePr>
               <a:graphicFrameLocks noChangeAspect="1"/>
@@ -16548,7 +16548,7 @@
                   <pic:spPr>
                     <a:xfrm>
                       <a:off x="0" y="0"/>
-                      <a:ext cx="5669280" cy="3589400"/>
+                      <a:ext cx="4800600" cy="3039412"/>
                     </a:xfrm>
                     <a:prstGeom prst="rect"/>
                   </pic:spPr>

</xml_diff>

<commit_message>
Clean Milestone 1 wording artifacts
</commit_message>
<xml_diff>
--- a/Milestone_1_Insurance_Price_Prediction.docx
+++ b/Milestone_1_Insurance_Price_Prediction.docx
@@ -15371,7 +15371,7 @@
         <w:t xml:space="preserve">Business interpretation: </w:t>
       </w:r>
       <w:r>
-        <w:t>Coverage status may proxy applicant history or insurance behavior, so it should be explained carefully in reviewer-facing material.</w:t>
+        <w:t>Coverage status may proxy applicant history or insurance behavior, so it should be explained carefully in project material.</w:t>
       </w:r>
     </w:p>
     <w:p>
@@ -15855,7 +15855,7 @@
         <w:t xml:space="preserve">Business interpretation: </w:t>
       </w:r>
       <w:r>
-        <w:t>Segment views help reviewers see whether weak marginal effects become meaningful when combined with other applicant characteristics.</w:t>
+        <w:t>Segment views help check whether weak marginal effects become meaningful when combined with other applicant characteristics.</w:t>
       </w:r>
     </w:p>
     <w:p>

</xml_diff>

<commit_message>
Add Milestone 1 workflow visual
</commit_message>
<xml_diff>
--- a/Milestone_1_Insurance_Price_Prediction.docx
+++ b/Milestone_1_Insurance_Price_Prediction.docx
@@ -159,6 +159,453 @@
       </w:pPr>
       <w:r>
         <w:t>Prepare a reproducible pipeline for Milestone 2 model building and deployment.</w:t>
+      </w:r>
+    </w:p>
+    <w:p>
+      <w:pPr>
+        <w:pStyle w:val="Heading2"/>
+      </w:pPr>
+      <w:r>
+        <w:t>Visual Summary and Image Plan</w:t>
+      </w:r>
+    </w:p>
+    <w:p>
+      <w:pPr>
+        <w:spacing w:after="120"/>
+      </w:pPr>
+      <w:r>
+        <w:t>The workflow figure gives a one-page view of how Milestone 1 moves from raw data checks to a modeling-ready dataset. It complements the detailed EDA charts that follow and helps connect the target-grid finding, missingness treatment, and preprocessing choices.</w:t>
+      </w:r>
+    </w:p>
+    <w:p>
+      <w:pPr>
+        <w:spacing w:before="80" w:after="40"/>
+        <w:jc w:val="center"/>
+      </w:pPr>
+      <w:r>
+        <w:drawing>
+          <wp:inline xmlns:a="http://schemas.openxmlformats.org/drawingml/2006/main" xmlns:pic="http://schemas.openxmlformats.org/drawingml/2006/picture">
+            <wp:extent cx="6217920" cy="2637905"/>
+            <wp:docPr id="47" name="Picture 47"/>
+            <wp:cNvGraphicFramePr>
+              <a:graphicFrameLocks noChangeAspect="1"/>
+            </wp:cNvGraphicFramePr>
+            <a:graphic>
+              <a:graphicData uri="http://schemas.openxmlformats.org/drawingml/2006/picture">
+                <pic:pic>
+                  <pic:nvPicPr>
+                    <pic:cNvPr id="0" name="milestone1_workflow_paperbanana.png"/>
+                    <pic:cNvPicPr/>
+                  </pic:nvPicPr>
+                  <pic:blipFill>
+                    <a:blip r:embed="rId57"/>
+                    <a:stretch>
+                      <a:fillRect/>
+                    </a:stretch>
+                  </pic:blipFill>
+                  <pic:spPr>
+                    <a:xfrm>
+                      <a:off x="0" y="0"/>
+                      <a:ext cx="6217920" cy="2637905"/>
+                    </a:xfrm>
+                    <a:prstGeom prst="rect"/>
+                  </pic:spPr>
+                </pic:pic>
+              </a:graphicData>
+            </a:graphic>
+          </wp:inline>
+        </w:drawing>
+      </w:r>
+    </w:p>
+    <w:p>
+      <w:pPr>
+        <w:spacing w:after="160"/>
+        <w:jc w:val="center"/>
+      </w:pPr>
+      <w:r>
+        <w:rPr>
+          <w:i/>
+          <w:sz w:val="18"/>
+        </w:rPr>
+        <w:t>Figure 1. Milestone 1 data audit and EDA workflow for insurance price prediction.</w:t>
+      </w:r>
+    </w:p>
+    <w:tbl>
+      <w:tblPr>
+        <w:tblStyle w:val="TableGrid"/>
+        <w:tblW w:type="auto" w:w="0"/>
+        <w:jc w:val="center"/>
+        <w:tblLook w:firstColumn="1" w:firstRow="1" w:lastColumn="0" w:lastRow="0" w:noHBand="0" w:noVBand="1" w:val="04A0"/>
+      </w:tblPr>
+      <w:tblGrid>
+        <w:gridCol w:w="2880"/>
+        <w:gridCol w:w="2880"/>
+        <w:gridCol w:w="2880"/>
+      </w:tblGrid>
+      <w:tr>
+        <w:tc>
+          <w:tcPr>
+            <w:tcW w:type="dxa" w:w="2880"/>
+            <w:vAlign w:val="center"/>
+            <w:shd w:fill="D9EAF7"/>
+          </w:tcPr>
+          <w:p>
+            <w:pPr>
+              <w:spacing w:after="40"/>
+            </w:pPr>
+            <w:r/>
+            <w:r>
+              <w:rPr>
+                <w:b/>
+                <w:sz w:val="17"/>
+              </w:rPr>
+              <w:t>Image candidate</w:t>
+            </w:r>
+          </w:p>
+        </w:tc>
+        <w:tc>
+          <w:tcPr>
+            <w:tcW w:type="dxa" w:w="2880"/>
+            <w:vAlign w:val="center"/>
+            <w:shd w:fill="D9EAF7"/>
+          </w:tcPr>
+          <w:p>
+            <w:pPr>
+              <w:spacing w:after="40"/>
+            </w:pPr>
+            <w:r/>
+            <w:r>
+              <w:rPr>
+                <w:b/>
+                <w:sz w:val="17"/>
+              </w:rPr>
+              <w:t>Purpose in Milestone 1</w:t>
+            </w:r>
+          </w:p>
+        </w:tc>
+        <w:tc>
+          <w:tcPr>
+            <w:tcW w:type="dxa" w:w="2880"/>
+            <w:vAlign w:val="center"/>
+            <w:shd w:fill="D9EAF7"/>
+          </w:tcPr>
+          <w:p>
+            <w:pPr>
+              <w:spacing w:after="40"/>
+            </w:pPr>
+            <w:r/>
+            <w:r>
+              <w:rPr>
+                <w:b/>
+                <w:sz w:val="17"/>
+              </w:rPr>
+              <w:t>Status</w:t>
+            </w:r>
+          </w:p>
+        </w:tc>
+      </w:tr>
+      <w:tr>
+        <w:tc>
+          <w:tcPr>
+            <w:tcW w:type="dxa" w:w="2880"/>
+            <w:vAlign w:val="center"/>
+          </w:tcPr>
+          <w:p>
+            <w:pPr>
+              <w:spacing w:after="40"/>
+            </w:pPr>
+            <w:r/>
+            <w:r>
+              <w:rPr>
+                <w:b w:val="0"/>
+                <w:sz w:val="17"/>
+              </w:rPr>
+              <w:t>Milestone 1 workflow overview</w:t>
+            </w:r>
+          </w:p>
+        </w:tc>
+        <w:tc>
+          <w:tcPr>
+            <w:tcW w:type="dxa" w:w="2880"/>
+            <w:vAlign w:val="center"/>
+          </w:tcPr>
+          <w:p>
+            <w:pPr>
+              <w:spacing w:after="40"/>
+            </w:pPr>
+            <w:r/>
+            <w:r>
+              <w:rPr>
+                <w:b w:val="0"/>
+                <w:sz w:val="17"/>
+              </w:rPr>
+              <w:t>Summarizes the data audit, EDA, preprocessing, and handoff flow.</w:t>
+            </w:r>
+          </w:p>
+        </w:tc>
+        <w:tc>
+          <w:tcPr>
+            <w:tcW w:type="dxa" w:w="2880"/>
+            <w:vAlign w:val="center"/>
+          </w:tcPr>
+          <w:p>
+            <w:pPr>
+              <w:spacing w:after="40"/>
+            </w:pPr>
+            <w:r/>
+            <w:r>
+              <w:rPr>
+                <w:b w:val="0"/>
+                <w:sz w:val="17"/>
+              </w:rPr>
+              <w:t>Added</w:t>
+            </w:r>
+          </w:p>
+        </w:tc>
+      </w:tr>
+      <w:tr>
+        <w:tc>
+          <w:tcPr>
+            <w:tcW w:type="dxa" w:w="2880"/>
+            <w:vAlign w:val="center"/>
+          </w:tcPr>
+          <w:p>
+            <w:pPr>
+              <w:spacing w:after="40"/>
+            </w:pPr>
+            <w:r/>
+            <w:r>
+              <w:rPr>
+                <w:b w:val="0"/>
+                <w:sz w:val="17"/>
+              </w:rPr>
+              <w:t>Target quote-grid explainer</w:t>
+            </w:r>
+          </w:p>
+        </w:tc>
+        <w:tc>
+          <w:tcPr>
+            <w:tcW w:type="dxa" w:w="2880"/>
+            <w:vAlign w:val="center"/>
+          </w:tcPr>
+          <w:p>
+            <w:pPr>
+              <w:spacing w:after="40"/>
+            </w:pPr>
+            <w:r/>
+            <w:r>
+              <w:rPr>
+                <w:b w:val="0"/>
+                <w:sz w:val="17"/>
+              </w:rPr>
+              <w:t>Clarifies why insurance_cost is evaluated as 54 quote bands.</w:t>
+            </w:r>
+          </w:p>
+        </w:tc>
+        <w:tc>
+          <w:tcPr>
+            <w:tcW w:type="dxa" w:w="2880"/>
+            <w:vAlign w:val="center"/>
+          </w:tcPr>
+          <w:p>
+            <w:pPr>
+              <w:spacing w:after="40"/>
+            </w:pPr>
+            <w:r/>
+            <w:r>
+              <w:rPr>
+                <w:b w:val="0"/>
+                <w:sz w:val="17"/>
+              </w:rPr>
+              <w:t>Covered by target-grid chart</w:t>
+            </w:r>
+          </w:p>
+        </w:tc>
+      </w:tr>
+      <w:tr>
+        <w:tc>
+          <w:tcPr>
+            <w:tcW w:type="dxa" w:w="2880"/>
+            <w:vAlign w:val="center"/>
+          </w:tcPr>
+          <w:p>
+            <w:pPr>
+              <w:spacing w:after="40"/>
+            </w:pPr>
+            <w:r/>
+            <w:r>
+              <w:rPr>
+                <w:b w:val="0"/>
+                <w:sz w:val="17"/>
+              </w:rPr>
+              <w:t>Missingness handling map</w:t>
+            </w:r>
+          </w:p>
+        </w:tc>
+        <w:tc>
+          <w:tcPr>
+            <w:tcW w:type="dxa" w:w="2880"/>
+            <w:vAlign w:val="center"/>
+          </w:tcPr>
+          <w:p>
+            <w:pPr>
+              <w:spacing w:after="40"/>
+            </w:pPr>
+            <w:r/>
+            <w:r>
+              <w:rPr>
+                <w:b w:val="0"/>
+                <w:sz w:val="17"/>
+              </w:rPr>
+              <w:t>Shows why BMI and admission-year missingness are handled differently.</w:t>
+            </w:r>
+          </w:p>
+        </w:tc>
+        <w:tc>
+          <w:tcPr>
+            <w:tcW w:type="dxa" w:w="2880"/>
+            <w:vAlign w:val="center"/>
+          </w:tcPr>
+          <w:p>
+            <w:pPr>
+              <w:spacing w:after="40"/>
+            </w:pPr>
+            <w:r/>
+            <w:r>
+              <w:rPr>
+                <w:b w:val="0"/>
+                <w:sz w:val="17"/>
+              </w:rPr>
+              <w:t>Covered by missingness charts</w:t>
+            </w:r>
+          </w:p>
+        </w:tc>
+      </w:tr>
+      <w:tr>
+        <w:tc>
+          <w:tcPr>
+            <w:tcW w:type="dxa" w:w="2880"/>
+            <w:vAlign w:val="center"/>
+          </w:tcPr>
+          <w:p>
+            <w:pPr>
+              <w:spacing w:after="40"/>
+            </w:pPr>
+            <w:r/>
+            <w:r>
+              <w:rPr>
+                <w:b w:val="0"/>
+                <w:sz w:val="17"/>
+              </w:rPr>
+              <w:t>Preprocessing pipeline diagram</w:t>
+            </w:r>
+          </w:p>
+        </w:tc>
+        <w:tc>
+          <w:tcPr>
+            <w:tcW w:type="dxa" w:w="2880"/>
+            <w:vAlign w:val="center"/>
+          </w:tcPr>
+          <w:p>
+            <w:pPr>
+              <w:spacing w:after="40"/>
+            </w:pPr>
+            <w:r/>
+            <w:r>
+              <w:rPr>
+                <w:b w:val="0"/>
+                <w:sz w:val="17"/>
+              </w:rPr>
+              <w:t>Shows ID exclusion, typo cleanup, imputation, and engineered features.</w:t>
+            </w:r>
+          </w:p>
+        </w:tc>
+        <w:tc>
+          <w:tcPr>
+            <w:tcW w:type="dxa" w:w="2880"/>
+            <w:vAlign w:val="center"/>
+          </w:tcPr>
+          <w:p>
+            <w:pPr>
+              <w:spacing w:after="40"/>
+            </w:pPr>
+            <w:r/>
+            <w:r>
+              <w:rPr>
+                <w:b w:val="0"/>
+                <w:sz w:val="17"/>
+              </w:rPr>
+              <w:t>Optional for final deck</w:t>
+            </w:r>
+          </w:p>
+        </w:tc>
+      </w:tr>
+      <w:tr>
+        <w:tc>
+          <w:tcPr>
+            <w:tcW w:type="dxa" w:w="2880"/>
+            <w:vAlign w:val="center"/>
+          </w:tcPr>
+          <w:p>
+            <w:pPr>
+              <w:spacing w:after="40"/>
+            </w:pPr>
+            <w:r/>
+            <w:r>
+              <w:rPr>
+                <w:b w:val="0"/>
+                <w:sz w:val="17"/>
+              </w:rPr>
+              <w:t>Signal-strength summary graphic</w:t>
+            </w:r>
+          </w:p>
+        </w:tc>
+        <w:tc>
+          <w:tcPr>
+            <w:tcW w:type="dxa" w:w="2880"/>
+            <w:vAlign w:val="center"/>
+          </w:tcPr>
+          <w:p>
+            <w:pPr>
+              <w:spacing w:after="40"/>
+            </w:pPr>
+            <w:r/>
+            <w:r>
+              <w:rPr>
+                <w:b w:val="0"/>
+                <w:sz w:val="17"/>
+              </w:rPr>
+              <w:t>Highlights strong and weak observed EDA signals without overclaiming.</w:t>
+            </w:r>
+          </w:p>
+        </w:tc>
+        <w:tc>
+          <w:tcPr>
+            <w:tcW w:type="dxa" w:w="2880"/>
+            <w:vAlign w:val="center"/>
+          </w:tcPr>
+          <w:p>
+            <w:pPr>
+              <w:spacing w:after="40"/>
+            </w:pPr>
+            <w:r/>
+            <w:r>
+              <w:rPr>
+                <w:b w:val="0"/>
+                <w:sz w:val="17"/>
+              </w:rPr>
+              <w:t>Covered by EDA sections</w:t>
+            </w:r>
+          </w:p>
+        </w:tc>
+      </w:tr>
+    </w:tbl>
+    <w:p>
+      <w:pPr>
+        <w:spacing w:before="120" w:after="160"/>
+      </w:pPr>
+      <w:r>
+        <w:t>The report keeps the statistical plots as the main evidence and uses the generated workflow image only as an orientation aid.</w:t>
       </w:r>
     </w:p>
     <w:p>

</xml_diff>